<commit_message>
update DEV-53 OID according to PCD registry
</commit_message>
<xml_diff>
--- a/AsciiDoc_Source/IHE_DEV_Suppl_PCMC.docx
+++ b/AsciiDoc_Source/IHE_DEV_Suppl_PCMC.docx
@@ -1,6 +1,6 @@
 
 <file path=word/document.xml><?xml version="1.0" encoding="utf-8"?>
-<w:document xmlns:wpc="http://schemas.microsoft.com/office/word/2010/wordprocessingCanvas" xmlns:cx="http://schemas.microsoft.com/office/drawing/2014/chartex" xmlns:cx1="http://schemas.microsoft.com/office/drawing/2015/9/8/chartex" xmlns:cx2="http://schemas.microsoft.com/office/drawing/2015/10/21/chartex" xmlns:cx3="http://schemas.microsoft.com/office/drawing/2016/5/9/chartex" xmlns:cx4="http://schemas.microsoft.com/office/drawing/2016/5/10/chartex" xmlns:cx5="http://schemas.microsoft.com/office/drawing/2016/5/11/chartex" xmlns:cx6="http://schemas.microsoft.com/office/drawing/2016/5/12/chartex" xmlns:cx7="http://schemas.microsoft.com/office/drawing/2016/5/13/chartex" xmlns:cx8="http://schemas.microsoft.com/office/drawing/2016/5/14/chartex" xmlns:mc="http://schemas.openxmlformats.org/markup-compatibility/2006" xmlns:aink="http://schemas.microsoft.com/office/drawing/2016/ink" xmlns:am3d="http://schemas.microsoft.com/office/drawing/2017/model3d" xmlns:o="urn:schemas-microsoft-com:office:office" xmlns:oel="http://schemas.microsoft.com/office/2019/extlst" xmlns:r="http://schemas.openxmlformats.org/officeDocument/2006/relationships" xmlns:m="http://schemas.openxmlformats.org/officeDocument/2006/math" xmlns:v="urn:schemas-microsoft-com:vml" xmlns:wp14="http://schemas.microsoft.com/office/word/2010/wordprocessingDrawing" xmlns:wp="http://schemas.openxmlformats.org/drawingml/2006/wordprocessingDrawing" xmlns:w10="urn:schemas-microsoft-com:office:word" xmlns:w="http://schemas.openxmlformats.org/wordprocessingml/2006/main" xmlns:w14="http://schemas.microsoft.com/office/word/2010/wordml" xmlns:w15="http://schemas.microsoft.com/office/word/2012/wordml" xmlns:w16cex="http://schemas.microsoft.com/office/word/2018/wordml/cex" xmlns:w16cid="http://schemas.microsoft.com/office/word/2016/wordml/cid" xmlns:w16="http://schemas.microsoft.com/office/word/2018/wordml" xmlns:w16du="http://schemas.microsoft.com/office/word/2023/wordml/word16du" xmlns:w16sdtdh="http://schemas.microsoft.com/office/word/2020/wordml/sdtdatahash" xmlns:w16sdtfl="http://schemas.microsoft.com/office/word/2024/wordml/sdtformatlock" xmlns:w16se="http://schemas.microsoft.com/office/word/2015/wordml/symex" xmlns:wpg="http://schemas.microsoft.com/office/word/2010/wordprocessingGroup" xmlns:wpi="http://schemas.microsoft.com/office/word/2010/wordprocessingInk" xmlns:wne="http://schemas.microsoft.com/office/word/2006/wordml" xmlns:wps="http://schemas.microsoft.com/office/word/2010/wordprocessingShape" mc:Ignorable="w14 w15 w16se w16cid w16 w16cex w16sdtdh w16sdtfl w16du wp14">
+<w:document xmlns:wpc="http://schemas.microsoft.com/office/word/2010/wordprocessingCanvas" xmlns:cx="http://schemas.microsoft.com/office/drawing/2014/chartex" xmlns:cx1="http://schemas.microsoft.com/office/drawing/2015/9/8/chartex" xmlns:cx2="http://schemas.microsoft.com/office/drawing/2015/10/21/chartex" xmlns:cx3="http://schemas.microsoft.com/office/drawing/2016/5/9/chartex" xmlns:cx4="http://schemas.microsoft.com/office/drawing/2016/5/10/chartex" xmlns:cx5="http://schemas.microsoft.com/office/drawing/2016/5/11/chartex" xmlns:cx6="http://schemas.microsoft.com/office/drawing/2016/5/12/chartex" xmlns:cx7="http://schemas.microsoft.com/office/drawing/2016/5/13/chartex" xmlns:cx8="http://schemas.microsoft.com/office/drawing/2016/5/14/chartex" xmlns:mc="http://schemas.openxmlformats.org/markup-compatibility/2006" xmlns:aink="http://schemas.microsoft.com/office/drawing/2016/ink" xmlns:am3d="http://schemas.microsoft.com/office/drawing/2017/model3d" xmlns:o="urn:schemas-microsoft-com:office:office" xmlns:oel="http://schemas.microsoft.com/office/2019/extlst" xmlns:r="http://schemas.openxmlformats.org/officeDocument/2006/relationships" xmlns:m="http://schemas.openxmlformats.org/officeDocument/2006/math" xmlns:v="urn:schemas-microsoft-com:vml" xmlns:wp14="http://schemas.microsoft.com/office/word/2010/wordprocessingDrawing" xmlns:wp="http://schemas.openxmlformats.org/drawingml/2006/wordprocessingDrawing" xmlns:w10="urn:schemas-microsoft-com:office:word" xmlns:w="http://schemas.openxmlformats.org/wordprocessingml/2006/main" xmlns:w14="http://schemas.microsoft.com/office/word/2010/wordml" xmlns:w15="http://schemas.microsoft.com/office/word/2012/wordml" xmlns:w16cei="http://schemas.microsoft.com/office/word/2026/wordml/cei" xmlns:w16cex="http://schemas.microsoft.com/office/word/2018/wordml/cex" xmlns:w16cid="http://schemas.microsoft.com/office/word/2016/wordml/cid" xmlns:w16="http://schemas.microsoft.com/office/word/2018/wordml" xmlns:w16du="http://schemas.microsoft.com/office/word/2023/wordml/word16du" xmlns:w16sdtdh="http://schemas.microsoft.com/office/word/2020/wordml/sdtdatahash" xmlns:w16sdtfl="http://schemas.microsoft.com/office/word/2024/wordml/sdtformatlock" xmlns:w16se="http://schemas.microsoft.com/office/word/2015/wordml/symex" xmlns:wpg="http://schemas.microsoft.com/office/word/2010/wordprocessingGroup" xmlns:wpi="http://schemas.microsoft.com/office/word/2010/wordprocessingInk" xmlns:wne="http://schemas.microsoft.com/office/word/2006/wordml" xmlns:wps="http://schemas.microsoft.com/office/word/2010/wordprocessingShape" mc:Ignorable="w14 w15 w16se w16cid w16 w16cex w16sdtdh w16sdtfl w16du wp14">
   <w:body>
     <w:p>
       <w:pPr>
@@ -6860,12 +6860,12 @@
                           <a:effectLst/>
                           <a:extLst>
                             <a:ext uri="{909E8E84-426E-40dd-AFC4-6F175D3DCCD1}">
-                              <a14:hiddenFill xmlns:a14="http://schemas.microsoft.com/office/drawing/2010/main" xmlns:w="http://schemas.openxmlformats.org/wordprocessingml/2006/main" xmlns:w10="urn:schemas-microsoft-com:office:word" xmlns:v="urn:schemas-microsoft-com:vml" xmlns:o="urn:schemas-microsoft-com:office:office" xmlns:mv="urn:schemas-microsoft-com:mac:vml" xmlns:mo="http://schemas.microsoft.com/office/mac/office/2008/main" xmlns="">
+                              <a14:hiddenFill xmlns="" xmlns:mo="http://schemas.microsoft.com/office/mac/office/2008/main" xmlns:mv="urn:schemas-microsoft-com:mac:vml" xmlns:o="urn:schemas-microsoft-com:office:office" xmlns:v="urn:schemas-microsoft-com:vml" xmlns:w10="urn:schemas-microsoft-com:office:word" xmlns:w="http://schemas.openxmlformats.org/wordprocessingml/2006/main" xmlns:a14="http://schemas.microsoft.com/office/drawing/2010/main">
                                 <a:noFill/>
                               </a14:hiddenFill>
                             </a:ext>
                             <a:ext uri="{AF507438-7753-43e0-B8FC-AC1667EBCBE1}">
-                              <a14:hiddenEffects xmlns:a14="http://schemas.microsoft.com/office/drawing/2010/main" xmlns:w="http://schemas.openxmlformats.org/wordprocessingml/2006/main" xmlns:w10="urn:schemas-microsoft-com:office:word" xmlns:v="urn:schemas-microsoft-com:vml" xmlns:o="urn:schemas-microsoft-com:office:office" xmlns:mv="urn:schemas-microsoft-com:mac:vml" xmlns:mo="http://schemas.microsoft.com/office/mac/office/2008/main" xmlns="">
+                              <a14:hiddenEffects xmlns="" xmlns:mo="http://schemas.microsoft.com/office/mac/office/2008/main" xmlns:mv="urn:schemas-microsoft-com:mac:vml" xmlns:o="urn:schemas-microsoft-com:office:office" xmlns:v="urn:schemas-microsoft-com:vml" xmlns:w10="urn:schemas-microsoft-com:office:word" xmlns:w="http://schemas.openxmlformats.org/wordprocessingml/2006/main" xmlns:a14="http://schemas.microsoft.com/office/drawing/2010/main">
                                 <a:effectLst>
                                   <a:outerShdw dist="35921" dir="2700000" algn="ctr" rotWithShape="0">
                                     <a:srgbClr val="808080"/>
@@ -6902,12 +6902,12 @@
                           <a:effectLst/>
                           <a:extLst>
                             <a:ext uri="{909E8E84-426E-40dd-AFC4-6F175D3DCCD1}">
-                              <a14:hiddenFill xmlns:a14="http://schemas.microsoft.com/office/drawing/2010/main" xmlns:w="http://schemas.openxmlformats.org/wordprocessingml/2006/main" xmlns:w10="urn:schemas-microsoft-com:office:word" xmlns:v="urn:schemas-microsoft-com:vml" xmlns:o="urn:schemas-microsoft-com:office:office" xmlns:mv="urn:schemas-microsoft-com:mac:vml" xmlns:mo="http://schemas.microsoft.com/office/mac/office/2008/main" xmlns="">
+                              <a14:hiddenFill xmlns="" xmlns:mo="http://schemas.microsoft.com/office/mac/office/2008/main" xmlns:mv="urn:schemas-microsoft-com:mac:vml" xmlns:o="urn:schemas-microsoft-com:office:office" xmlns:v="urn:schemas-microsoft-com:vml" xmlns:w10="urn:schemas-microsoft-com:office:word" xmlns:w="http://schemas.openxmlformats.org/wordprocessingml/2006/main" xmlns:a14="http://schemas.microsoft.com/office/drawing/2010/main">
                                 <a:noFill/>
                               </a14:hiddenFill>
                             </a:ext>
                             <a:ext uri="{AF507438-7753-43e0-B8FC-AC1667EBCBE1}">
-                              <a14:hiddenEffects xmlns:a14="http://schemas.microsoft.com/office/drawing/2010/main" xmlns:w="http://schemas.openxmlformats.org/wordprocessingml/2006/main" xmlns:w10="urn:schemas-microsoft-com:office:word" xmlns:v="urn:schemas-microsoft-com:vml" xmlns:o="urn:schemas-microsoft-com:office:office" xmlns:mv="urn:schemas-microsoft-com:mac:vml" xmlns:mo="http://schemas.microsoft.com/office/mac/office/2008/main" xmlns="">
+                              <a14:hiddenEffects xmlns="" xmlns:mo="http://schemas.microsoft.com/office/mac/office/2008/main" xmlns:mv="urn:schemas-microsoft-com:mac:vml" xmlns:o="urn:schemas-microsoft-com:office:office" xmlns:v="urn:schemas-microsoft-com:vml" xmlns:w10="urn:schemas-microsoft-com:office:word" xmlns:w="http://schemas.openxmlformats.org/wordprocessingml/2006/main" xmlns:a14="http://schemas.microsoft.com/office/drawing/2010/main">
                                 <a:effectLst>
                                   <a:outerShdw dist="35921" dir="2700000" algn="ctr" rotWithShape="0">
                                     <a:srgbClr val="808080"/>
@@ -6939,14 +6939,14 @@
                           <a:effectLst/>
                           <a:extLst>
                             <a:ext uri="{909E8E84-426E-40dd-AFC4-6F175D3DCCD1}">
-                              <a14:hiddenFill xmlns:a14="http://schemas.microsoft.com/office/drawing/2010/main" xmlns:w="http://schemas.openxmlformats.org/wordprocessingml/2006/main" xmlns:w10="urn:schemas-microsoft-com:office:word" xmlns:v="urn:schemas-microsoft-com:vml" xmlns:o="urn:schemas-microsoft-com:office:office" xmlns:mv="urn:schemas-microsoft-com:mac:vml" xmlns:mo="http://schemas.microsoft.com/office/mac/office/2008/main" xmlns="">
+                              <a14:hiddenFill xmlns="" xmlns:mo="http://schemas.microsoft.com/office/mac/office/2008/main" xmlns:mv="urn:schemas-microsoft-com:mac:vml" xmlns:o="urn:schemas-microsoft-com:office:office" xmlns:v="urn:schemas-microsoft-com:vml" xmlns:w10="urn:schemas-microsoft-com:office:word" xmlns:w="http://schemas.openxmlformats.org/wordprocessingml/2006/main" xmlns:a14="http://schemas.microsoft.com/office/drawing/2010/main">
                                 <a:solidFill>
                                   <a:srgbClr val="FFFFFF"/>
                                 </a:solidFill>
                               </a14:hiddenFill>
                             </a:ext>
                             <a:ext uri="{91240B29-F687-4f45-9708-019B960494DF}">
-                              <a14:hiddenLine xmlns:a14="http://schemas.microsoft.com/office/drawing/2010/main" xmlns:w="http://schemas.openxmlformats.org/wordprocessingml/2006/main" xmlns:w10="urn:schemas-microsoft-com:office:word" xmlns:v="urn:schemas-microsoft-com:vml" xmlns:o="urn:schemas-microsoft-com:office:office" xmlns:mv="urn:schemas-microsoft-com:mac:vml" xmlns:mo="http://schemas.microsoft.com/office/mac/office/2008/main" xmlns="" w="0">
+                              <a14:hiddenLine xmlns="" xmlns:mo="http://schemas.microsoft.com/office/mac/office/2008/main" xmlns:mv="urn:schemas-microsoft-com:mac:vml" xmlns:o="urn:schemas-microsoft-com:office:office" xmlns:v="urn:schemas-microsoft-com:vml" xmlns:w10="urn:schemas-microsoft-com:office:word" xmlns:w="http://schemas.openxmlformats.org/wordprocessingml/2006/main" xmlns:a14="http://schemas.microsoft.com/office/drawing/2010/main" w="0">
                                 <a:solidFill>
                                   <a:srgbClr val="000000"/>
                                 </a:solidFill>
@@ -6956,7 +6956,7 @@
                               </a14:hiddenLine>
                             </a:ext>
                             <a:ext uri="{AF507438-7753-43e0-B8FC-AC1667EBCBE1}">
-                              <a14:hiddenEffects xmlns:a14="http://schemas.microsoft.com/office/drawing/2010/main" xmlns:w="http://schemas.openxmlformats.org/wordprocessingml/2006/main" xmlns:w10="urn:schemas-microsoft-com:office:word" xmlns:v="urn:schemas-microsoft-com:vml" xmlns:o="urn:schemas-microsoft-com:office:office" xmlns:mv="urn:schemas-microsoft-com:mac:vml" xmlns:mo="http://schemas.microsoft.com/office/mac/office/2008/main" xmlns="">
+                              <a14:hiddenEffects xmlns="" xmlns:mo="http://schemas.microsoft.com/office/mac/office/2008/main" xmlns:mv="urn:schemas-microsoft-com:mac:vml" xmlns:o="urn:schemas-microsoft-com:office:office" xmlns:v="urn:schemas-microsoft-com:vml" xmlns:w10="urn:schemas-microsoft-com:office:word" xmlns:w="http://schemas.openxmlformats.org/wordprocessingml/2006/main" xmlns:a14="http://schemas.microsoft.com/office/drawing/2010/main">
                                 <a:effectLst/>
                               </a14:hiddenEffects>
                             </a:ext>
@@ -7136,14 +7136,14 @@
                           <a:effectLst/>
                           <a:extLst>
                             <a:ext uri="{909E8E84-426E-40dd-AFC4-6F175D3DCCD1}">
-                              <a14:hiddenFill xmlns:a14="http://schemas.microsoft.com/office/drawing/2010/main" xmlns:w="http://schemas.openxmlformats.org/wordprocessingml/2006/main" xmlns:w10="urn:schemas-microsoft-com:office:word" xmlns:v="urn:schemas-microsoft-com:vml" xmlns:o="urn:schemas-microsoft-com:office:office" xmlns:mv="urn:schemas-microsoft-com:mac:vml" xmlns:mo="http://schemas.microsoft.com/office/mac/office/2008/main" xmlns="">
+                              <a14:hiddenFill xmlns="" xmlns:mo="http://schemas.microsoft.com/office/mac/office/2008/main" xmlns:mv="urn:schemas-microsoft-com:mac:vml" xmlns:o="urn:schemas-microsoft-com:office:office" xmlns:v="urn:schemas-microsoft-com:vml" xmlns:w10="urn:schemas-microsoft-com:office:word" xmlns:w="http://schemas.openxmlformats.org/wordprocessingml/2006/main" xmlns:a14="http://schemas.microsoft.com/office/drawing/2010/main">
                                 <a:solidFill>
                                   <a:srgbClr val="FFFFFF"/>
                                 </a:solidFill>
                               </a14:hiddenFill>
                             </a:ext>
                             <a:ext uri="{91240B29-F687-4f45-9708-019B960494DF}">
-                              <a14:hiddenLine xmlns:a14="http://schemas.microsoft.com/office/drawing/2010/main" xmlns:w="http://schemas.openxmlformats.org/wordprocessingml/2006/main" xmlns:w10="urn:schemas-microsoft-com:office:word" xmlns:v="urn:schemas-microsoft-com:vml" xmlns:o="urn:schemas-microsoft-com:office:office" xmlns:mv="urn:schemas-microsoft-com:mac:vml" xmlns:mo="http://schemas.microsoft.com/office/mac/office/2008/main" xmlns="" w="0">
+                              <a14:hiddenLine xmlns="" xmlns:mo="http://schemas.microsoft.com/office/mac/office/2008/main" xmlns:mv="urn:schemas-microsoft-com:mac:vml" xmlns:o="urn:schemas-microsoft-com:office:office" xmlns:v="urn:schemas-microsoft-com:vml" xmlns:w10="urn:schemas-microsoft-com:office:word" xmlns:w="http://schemas.openxmlformats.org/wordprocessingml/2006/main" xmlns:a14="http://schemas.microsoft.com/office/drawing/2010/main" w="0">
                                 <a:solidFill>
                                   <a:srgbClr val="000000"/>
                                 </a:solidFill>
@@ -7153,7 +7153,7 @@
                               </a14:hiddenLine>
                             </a:ext>
                             <a:ext uri="{AF507438-7753-43e0-B8FC-AC1667EBCBE1}">
-                              <a14:hiddenEffects xmlns:a14="http://schemas.microsoft.com/office/drawing/2010/main" xmlns:w="http://schemas.openxmlformats.org/wordprocessingml/2006/main" xmlns:w10="urn:schemas-microsoft-com:office:word" xmlns:v="urn:schemas-microsoft-com:vml" xmlns:o="urn:schemas-microsoft-com:office:office" xmlns:mv="urn:schemas-microsoft-com:mac:vml" xmlns:mo="http://schemas.microsoft.com/office/mac/office/2008/main" xmlns="">
+                              <a14:hiddenEffects xmlns="" xmlns:mo="http://schemas.microsoft.com/office/mac/office/2008/main" xmlns:mv="urn:schemas-microsoft-com:mac:vml" xmlns:o="urn:schemas-microsoft-com:office:office" xmlns:v="urn:schemas-microsoft-com:vml" xmlns:w10="urn:schemas-microsoft-com:office:word" xmlns:w="http://schemas.openxmlformats.org/wordprocessingml/2006/main" xmlns:a14="http://schemas.microsoft.com/office/drawing/2010/main">
                                 <a:effectLst/>
                               </a14:hiddenEffects>
                             </a:ext>
@@ -11901,7 +11901,7 @@
                           </a:ln>
                           <a:extLst>
                             <a:ext uri="{91240B29-F687-4f45-9708-019B960494DF}">
-                              <a14:hiddenLine xmlns:a14="http://schemas.microsoft.com/office/drawing/2010/main" xmlns:w="http://schemas.openxmlformats.org/wordprocessingml/2006/main" xmlns:w10="urn:schemas-microsoft-com:office:word" xmlns:v="urn:schemas-microsoft-com:vml" xmlns:o="urn:schemas-microsoft-com:office:office" xmlns:mv="urn:schemas-microsoft-com:mac:vml" xmlns:mo="http://schemas.microsoft.com/office/mac/office/2008/main" xmlns="" w="9525">
+                              <a14:hiddenLine xmlns="" xmlns:mo="http://schemas.microsoft.com/office/mac/office/2008/main" xmlns:mv="urn:schemas-microsoft-com:mac:vml" xmlns:o="urn:schemas-microsoft-com:office:office" xmlns:v="urn:schemas-microsoft-com:vml" xmlns:w10="urn:schemas-microsoft-com:office:word" xmlns:w="http://schemas.openxmlformats.org/wordprocessingml/2006/main" xmlns:a14="http://schemas.microsoft.com/office/drawing/2010/main" w="9525">
                                 <a:solidFill>
                                   <a:srgbClr val="000000"/>
                                 </a:solidFill>
@@ -11968,7 +11968,7 @@
                           </a:ln>
                           <a:extLst>
                             <a:ext uri="{909E8E84-426E-40dd-AFC4-6F175D3DCCD1}">
-                              <a14:hiddenFill xmlns:a14="http://schemas.microsoft.com/office/drawing/2010/main" xmlns:w="http://schemas.openxmlformats.org/wordprocessingml/2006/main" xmlns:w10="urn:schemas-microsoft-com:office:word" xmlns:v="urn:schemas-microsoft-com:vml" xmlns:o="urn:schemas-microsoft-com:office:office" xmlns:mv="urn:schemas-microsoft-com:mac:vml" xmlns:mo="http://schemas.microsoft.com/office/mac/office/2008/main" xmlns="">
+                              <a14:hiddenFill xmlns="" xmlns:mo="http://schemas.microsoft.com/office/mac/office/2008/main" xmlns:mv="urn:schemas-microsoft-com:mac:vml" xmlns:o="urn:schemas-microsoft-com:office:office" xmlns:v="urn:schemas-microsoft-com:vml" xmlns:w10="urn:schemas-microsoft-com:office:word" xmlns:w="http://schemas.openxmlformats.org/wordprocessingml/2006/main" xmlns:a14="http://schemas.microsoft.com/office/drawing/2010/main">
                                 <a:noFill/>
                               </a14:hiddenFill>
                             </a:ext>
@@ -11995,14 +11995,14 @@
                           </a:ln>
                           <a:extLst>
                             <a:ext uri="{909E8E84-426E-40dd-AFC4-6F175D3DCCD1}">
-                              <a14:hiddenFill xmlns:a14="http://schemas.microsoft.com/office/drawing/2010/main" xmlns:w="http://schemas.openxmlformats.org/wordprocessingml/2006/main" xmlns:w10="urn:schemas-microsoft-com:office:word" xmlns:v="urn:schemas-microsoft-com:vml" xmlns:o="urn:schemas-microsoft-com:office:office" xmlns:mv="urn:schemas-microsoft-com:mac:vml" xmlns:mo="http://schemas.microsoft.com/office/mac/office/2008/main" xmlns="">
+                              <a14:hiddenFill xmlns="" xmlns:mo="http://schemas.microsoft.com/office/mac/office/2008/main" xmlns:mv="urn:schemas-microsoft-com:mac:vml" xmlns:o="urn:schemas-microsoft-com:office:office" xmlns:v="urn:schemas-microsoft-com:vml" xmlns:w10="urn:schemas-microsoft-com:office:word" xmlns:w="http://schemas.openxmlformats.org/wordprocessingml/2006/main" xmlns:a14="http://schemas.microsoft.com/office/drawing/2010/main">
                                 <a:solidFill>
                                   <a:srgbClr val="FFFFFF"/>
                                 </a:solidFill>
                               </a14:hiddenFill>
                             </a:ext>
                             <a:ext uri="{91240B29-F687-4f45-9708-019B960494DF}">
-                              <a14:hiddenLine xmlns:a14="http://schemas.microsoft.com/office/drawing/2010/main" xmlns:w="http://schemas.openxmlformats.org/wordprocessingml/2006/main" xmlns:w10="urn:schemas-microsoft-com:office:word" xmlns:v="urn:schemas-microsoft-com:vml" xmlns:o="urn:schemas-microsoft-com:office:office" xmlns:mv="urn:schemas-microsoft-com:mac:vml" xmlns:mo="http://schemas.microsoft.com/office/mac/office/2008/main" xmlns="" w="9525">
+                              <a14:hiddenLine xmlns="" xmlns:mo="http://schemas.microsoft.com/office/mac/office/2008/main" xmlns:mv="urn:schemas-microsoft-com:mac:vml" xmlns:o="urn:schemas-microsoft-com:office:office" xmlns:v="urn:schemas-microsoft-com:vml" xmlns:w10="urn:schemas-microsoft-com:office:word" xmlns:w="http://schemas.openxmlformats.org/wordprocessingml/2006/main" xmlns:a14="http://schemas.microsoft.com/office/drawing/2010/main" w="9525">
                                 <a:solidFill>
                                   <a:srgbClr val="000000"/>
                                 </a:solidFill>
@@ -12068,7 +12068,7 @@
                           </a:ln>
                           <a:extLst>
                             <a:ext uri="{909E8E84-426E-40dd-AFC4-6F175D3DCCD1}">
-                              <a14:hiddenFill xmlns:a14="http://schemas.microsoft.com/office/drawing/2010/main" xmlns:w="http://schemas.openxmlformats.org/wordprocessingml/2006/main" xmlns:w10="urn:schemas-microsoft-com:office:word" xmlns:v="urn:schemas-microsoft-com:vml" xmlns:o="urn:schemas-microsoft-com:office:office" xmlns:mv="urn:schemas-microsoft-com:mac:vml" xmlns:mo="http://schemas.microsoft.com/office/mac/office/2008/main" xmlns="">
+                              <a14:hiddenFill xmlns="" xmlns:mo="http://schemas.microsoft.com/office/mac/office/2008/main" xmlns:mv="urn:schemas-microsoft-com:mac:vml" xmlns:o="urn:schemas-microsoft-com:office:office" xmlns:v="urn:schemas-microsoft-com:vml" xmlns:w10="urn:schemas-microsoft-com:office:word" xmlns:w="http://schemas.openxmlformats.org/wordprocessingml/2006/main" xmlns:a14="http://schemas.microsoft.com/office/drawing/2010/main">
                                 <a:noFill/>
                               </a14:hiddenFill>
                             </a:ext>
@@ -12158,7 +12158,7 @@
                           </a:ln>
                           <a:extLst>
                             <a:ext uri="{909E8E84-426E-40dd-AFC4-6F175D3DCCD1}">
-                              <a14:hiddenFill xmlns:a14="http://schemas.microsoft.com/office/drawing/2010/main" xmlns:w="http://schemas.openxmlformats.org/wordprocessingml/2006/main" xmlns:w10="urn:schemas-microsoft-com:office:word" xmlns:v="urn:schemas-microsoft-com:vml" xmlns:o="urn:schemas-microsoft-com:office:office" xmlns:mv="urn:schemas-microsoft-com:mac:vml" xmlns:mo="http://schemas.microsoft.com/office/mac/office/2008/main" xmlns="">
+                              <a14:hiddenFill xmlns="" xmlns:mo="http://schemas.microsoft.com/office/mac/office/2008/main" xmlns:mv="urn:schemas-microsoft-com:mac:vml" xmlns:o="urn:schemas-microsoft-com:office:office" xmlns:v="urn:schemas-microsoft-com:vml" xmlns:w10="urn:schemas-microsoft-com:office:word" xmlns:w="http://schemas.openxmlformats.org/wordprocessingml/2006/main" xmlns:a14="http://schemas.microsoft.com/office/drawing/2010/main">
                                 <a:noFill/>
                               </a14:hiddenFill>
                             </a:ext>
@@ -12187,7 +12187,7 @@
                           </a:ln>
                           <a:extLst>
                             <a:ext uri="{91240B29-F687-4f45-9708-019B960494DF}">
-                              <a14:hiddenLine xmlns:a14="http://schemas.microsoft.com/office/drawing/2010/main" xmlns:w="http://schemas.openxmlformats.org/wordprocessingml/2006/main" xmlns:w10="urn:schemas-microsoft-com:office:word" xmlns:v="urn:schemas-microsoft-com:vml" xmlns:o="urn:schemas-microsoft-com:office:office" xmlns:mv="urn:schemas-microsoft-com:mac:vml" xmlns:mo="http://schemas.microsoft.com/office/mac/office/2008/main" xmlns="" w="9525">
+                              <a14:hiddenLine xmlns="" xmlns:mo="http://schemas.microsoft.com/office/mac/office/2008/main" xmlns:mv="urn:schemas-microsoft-com:mac:vml" xmlns:o="urn:schemas-microsoft-com:office:office" xmlns:v="urn:schemas-microsoft-com:vml" xmlns:w10="urn:schemas-microsoft-com:office:word" xmlns:w="http://schemas.openxmlformats.org/wordprocessingml/2006/main" xmlns:a14="http://schemas.microsoft.com/office/drawing/2010/main" w="9525">
                                 <a:solidFill>
                                   <a:srgbClr val="000000"/>
                                 </a:solidFill>
@@ -12253,7 +12253,7 @@
                           </a:ln>
                           <a:extLst>
                             <a:ext uri="{909E8E84-426E-40dd-AFC4-6F175D3DCCD1}">
-                              <a14:hiddenFill xmlns="" xmlns:mo="http://schemas.microsoft.com/office/mac/office/2008/main" xmlns:mv="urn:schemas-microsoft-com:mac:vml" xmlns:o="urn:schemas-microsoft-com:office:office" xmlns:v="urn:schemas-microsoft-com:vml" xmlns:w10="urn:schemas-microsoft-com:office:word" xmlns:w="http://schemas.openxmlformats.org/wordprocessingml/2006/main" xmlns:a14="http://schemas.microsoft.com/office/drawing/2010/main" xmlns:lc="http://schemas.openxmlformats.org/drawingml/2006/lockedCanvas">
+                              <a14:hiddenFill xmlns:lc="http://schemas.openxmlformats.org/drawingml/2006/lockedCanvas" xmlns:a14="http://schemas.microsoft.com/office/drawing/2010/main" xmlns:w="http://schemas.openxmlformats.org/wordprocessingml/2006/main" xmlns:w10="urn:schemas-microsoft-com:office:word" xmlns:v="urn:schemas-microsoft-com:vml" xmlns:o="urn:schemas-microsoft-com:office:office" xmlns:mv="urn:schemas-microsoft-com:mac:vml" xmlns:mo="http://schemas.microsoft.com/office/mac/office/2008/main" xmlns="">
                                 <a:noFill/>
                               </a14:hiddenFill>
                             </a:ext>
@@ -12280,14 +12280,14 @@
                           </a:ln>
                           <a:extLst>
                             <a:ext uri="{909E8E84-426E-40dd-AFC4-6F175D3DCCD1}">
-                              <a14:hiddenFill xmlns="" xmlns:mo="http://schemas.microsoft.com/office/mac/office/2008/main" xmlns:mv="urn:schemas-microsoft-com:mac:vml" xmlns:o="urn:schemas-microsoft-com:office:office" xmlns:v="urn:schemas-microsoft-com:vml" xmlns:w10="urn:schemas-microsoft-com:office:word" xmlns:w="http://schemas.openxmlformats.org/wordprocessingml/2006/main" xmlns:a14="http://schemas.microsoft.com/office/drawing/2010/main" xmlns:lc="http://schemas.openxmlformats.org/drawingml/2006/lockedCanvas">
+                              <a14:hiddenFill xmlns:lc="http://schemas.openxmlformats.org/drawingml/2006/lockedCanvas" xmlns:a14="http://schemas.microsoft.com/office/drawing/2010/main" xmlns:w="http://schemas.openxmlformats.org/wordprocessingml/2006/main" xmlns:w10="urn:schemas-microsoft-com:office:word" xmlns:v="urn:schemas-microsoft-com:vml" xmlns:o="urn:schemas-microsoft-com:office:office" xmlns:mv="urn:schemas-microsoft-com:mac:vml" xmlns:mo="http://schemas.microsoft.com/office/mac/office/2008/main" xmlns="">
                                 <a:solidFill>
                                   <a:srgbClr val="FFFFFF"/>
                                 </a:solidFill>
                               </a14:hiddenFill>
                             </a:ext>
                             <a:ext uri="{91240B29-F687-4f45-9708-019B960494DF}">
-                              <a14:hiddenLine xmlns="" xmlns:mo="http://schemas.microsoft.com/office/mac/office/2008/main" xmlns:mv="urn:schemas-microsoft-com:mac:vml" xmlns:o="urn:schemas-microsoft-com:office:office" xmlns:v="urn:schemas-microsoft-com:vml" xmlns:w10="urn:schemas-microsoft-com:office:word" xmlns:w="http://schemas.openxmlformats.org/wordprocessingml/2006/main" xmlns:a14="http://schemas.microsoft.com/office/drawing/2010/main" xmlns:lc="http://schemas.openxmlformats.org/drawingml/2006/lockedCanvas" w="9525">
+                              <a14:hiddenLine xmlns:lc="http://schemas.openxmlformats.org/drawingml/2006/lockedCanvas" xmlns:a14="http://schemas.microsoft.com/office/drawing/2010/main" xmlns:w="http://schemas.openxmlformats.org/wordprocessingml/2006/main" xmlns:w10="urn:schemas-microsoft-com:office:word" xmlns:v="urn:schemas-microsoft-com:vml" xmlns:o="urn:schemas-microsoft-com:office:office" xmlns:mv="urn:schemas-microsoft-com:mac:vml" xmlns:mo="http://schemas.microsoft.com/office/mac/office/2008/main" xmlns="" w="9525">
                                 <a:solidFill>
                                   <a:srgbClr val="000000"/>
                                 </a:solidFill>
@@ -19327,8 +19327,8 @@
         <w:tblLook w:val="04A0" w:firstRow="1" w:lastRow="0" w:firstColumn="1" w:lastColumn="0" w:noHBand="0" w:noVBand="1"/>
       </w:tblPr>
       <w:tblGrid>
-        <w:gridCol w:w="2695"/>
-        <w:gridCol w:w="6655"/>
+        <w:gridCol w:w="4775"/>
+        <w:gridCol w:w="4575"/>
       </w:tblGrid>
       <w:tr>
         <w:tc>
@@ -19369,9 +19369,26 @@
             <w:pPr>
               <w:pStyle w:val="TableEntry"/>
             </w:pPr>
-            <w:r>
-              <w:t>1.3.6.1.4.1.19376.1.6.1.53.1</w:t>
-            </w:r>
+            <w:commentRangeStart w:id="252"/>
+            <w:ins w:id="253" w:author="Druckenmueller, Marc" w:date="2026-08-07T14:28:00Z" w16du:dateUtc="2026-08-07T12:28:00Z">
+              <w:r>
+                <w:t>1.3.6.1.4.1.19376.1.6.4.53</w:t>
+              </w:r>
+            </w:ins>
+            <w:commentRangeEnd w:id="252"/>
+            <w:r>
+              <w:rPr>
+                <w:rStyle w:val="CommentReference"/>
+                <w:sz w:val="18"/>
+                <w:szCs w:val="20"/>
+              </w:rPr>
+              <w:commentReference w:id="252"/>
+            </w:r>
+            <w:del w:id="254" w:author="Druckenmueller, Marc" w:date="2026-08-07T14:28:00Z" w16du:dateUtc="2026-08-07T12:28:00Z">
+              <w:r>
+                <w:delText>1.3.6.1.4.1.19376.1.6.1.53.1</w:delText>
+              </w:r>
+            </w:del>
           </w:p>
         </w:tc>
         <w:tc>
@@ -19398,9 +19415,9 @@
       <w:pPr>
         <w:pStyle w:val="PartTitle"/>
       </w:pPr>
-      <w:bookmarkStart w:id="252" w:name="_Toc345074694"/>
-      <w:bookmarkStart w:id="253" w:name="_Toc18414947"/>
-      <w:bookmarkStart w:id="254" w:name="_Toc235097028"/>
+      <w:bookmarkStart w:id="255" w:name="_Toc345074694"/>
+      <w:bookmarkStart w:id="256" w:name="_Toc18414947"/>
+      <w:bookmarkStart w:id="257" w:name="_Toc235097028"/>
       <w:bookmarkEnd w:id="249"/>
       <w:bookmarkEnd w:id="250"/>
       <w:bookmarkEnd w:id="251"/>
@@ -19408,34 +19425,34 @@
         <w:lastRenderedPageBreak/>
         <w:t>Volume 3 – Content Modules</w:t>
       </w:r>
-      <w:bookmarkEnd w:id="252"/>
-      <w:bookmarkEnd w:id="253"/>
-      <w:bookmarkEnd w:id="254"/>
-    </w:p>
-    <w:p>
-      <w:pPr>
-        <w:pStyle w:val="BodyText"/>
-      </w:pPr>
-      <w:bookmarkStart w:id="255" w:name="OLE_LINK57"/>
-      <w:bookmarkStart w:id="256" w:name="OLE_LINK58"/>
-      <w:r>
-        <w:t>Not applicable.</w:t>
-      </w:r>
-    </w:p>
-    <w:p>
-      <w:pPr>
-        <w:pStyle w:val="BodyText"/>
-      </w:pPr>
-    </w:p>
-    <w:p>
-      <w:pPr>
-        <w:pStyle w:val="PartTitle"/>
-      </w:pPr>
-      <w:bookmarkStart w:id="257" w:name="_Toc345074737"/>
-      <w:bookmarkStart w:id="258" w:name="_Toc18414981"/>
-      <w:bookmarkStart w:id="259" w:name="_Toc235097029"/>
       <w:bookmarkEnd w:id="255"/>
       <w:bookmarkEnd w:id="256"/>
+      <w:bookmarkEnd w:id="257"/>
+    </w:p>
+    <w:p>
+      <w:pPr>
+        <w:pStyle w:val="BodyText"/>
+      </w:pPr>
+      <w:bookmarkStart w:id="258" w:name="OLE_LINK57"/>
+      <w:bookmarkStart w:id="259" w:name="OLE_LINK58"/>
+      <w:r>
+        <w:t>Not applicable.</w:t>
+      </w:r>
+    </w:p>
+    <w:p>
+      <w:pPr>
+        <w:pStyle w:val="BodyText"/>
+      </w:pPr>
+    </w:p>
+    <w:p>
+      <w:pPr>
+        <w:pStyle w:val="PartTitle"/>
+      </w:pPr>
+      <w:bookmarkStart w:id="260" w:name="_Toc345074737"/>
+      <w:bookmarkStart w:id="261" w:name="_Toc18414981"/>
+      <w:bookmarkStart w:id="262" w:name="_Toc235097029"/>
+      <w:bookmarkEnd w:id="258"/>
+      <w:bookmarkEnd w:id="259"/>
       <w:r>
         <w:lastRenderedPageBreak/>
         <w:t>V</w:t>
@@ -19443,9 +19460,9 @@
       <w:r>
         <w:t>olume 4 – National Extensions</w:t>
       </w:r>
-      <w:bookmarkEnd w:id="257"/>
-      <w:bookmarkEnd w:id="258"/>
-      <w:bookmarkEnd w:id="259"/>
+      <w:bookmarkEnd w:id="260"/>
+      <w:bookmarkEnd w:id="261"/>
+      <w:bookmarkEnd w:id="262"/>
     </w:p>
     <w:p>
       <w:pPr>
@@ -19475,11 +19492,11 @@
       </w:pPr>
     </w:p>
     <w:sectPr>
-      <w:headerReference w:type="even" r:id="rId33"/>
-      <w:headerReference w:type="default" r:id="rId34"/>
-      <w:footerReference w:type="even" r:id="rId35"/>
-      <w:footerReference w:type="default" r:id="rId36"/>
-      <w:footerReference w:type="first" r:id="rId37"/>
+      <w:headerReference w:type="even" r:id="rId37"/>
+      <w:headerReference w:type="default" r:id="rId38"/>
+      <w:footerReference w:type="even" r:id="rId39"/>
+      <w:footerReference w:type="default" r:id="rId40"/>
+      <w:footerReference w:type="first" r:id="rId41"/>
       <w:pgSz w:w="12240" w:h="15840" w:code="1"/>
       <w:pgMar w:top="1440" w:right="1080" w:bottom="1440" w:left="1800" w:header="720" w:footer="720" w:gutter="0"/>
       <w:lnNumType w:countBy="5" w:restart="continuous"/>
@@ -19492,8 +19509,47 @@
 </w:document>
 </file>
 
+<file path=word/comments.xml><?xml version="1.0" encoding="utf-8"?>
+<w:comments xmlns:wpc="http://schemas.microsoft.com/office/word/2010/wordprocessingCanvas" xmlns:cx="http://schemas.microsoft.com/office/drawing/2014/chartex" xmlns:cx1="http://schemas.microsoft.com/office/drawing/2015/9/8/chartex" xmlns:cx2="http://schemas.microsoft.com/office/drawing/2015/10/21/chartex" xmlns:cx3="http://schemas.microsoft.com/office/drawing/2016/5/9/chartex" xmlns:cx4="http://schemas.microsoft.com/office/drawing/2016/5/10/chartex" xmlns:cx5="http://schemas.microsoft.com/office/drawing/2016/5/11/chartex" xmlns:cx6="http://schemas.microsoft.com/office/drawing/2016/5/12/chartex" xmlns:cx7="http://schemas.microsoft.com/office/drawing/2016/5/13/chartex" xmlns:cx8="http://schemas.microsoft.com/office/drawing/2016/5/14/chartex" xmlns:mc="http://schemas.openxmlformats.org/markup-compatibility/2006" xmlns:aink="http://schemas.microsoft.com/office/drawing/2016/ink" xmlns:am3d="http://schemas.microsoft.com/office/drawing/2017/model3d" xmlns:o="urn:schemas-microsoft-com:office:office" xmlns:oel="http://schemas.microsoft.com/office/2019/extlst" xmlns:r="http://schemas.openxmlformats.org/officeDocument/2006/relationships" xmlns:m="http://schemas.openxmlformats.org/officeDocument/2006/math" xmlns:v="urn:schemas-microsoft-com:vml" xmlns:wp14="http://schemas.microsoft.com/office/word/2010/wordprocessingDrawing" xmlns:wp="http://schemas.openxmlformats.org/drawingml/2006/wordprocessingDrawing" xmlns:w10="urn:schemas-microsoft-com:office:word" xmlns:w="http://schemas.openxmlformats.org/wordprocessingml/2006/main" xmlns:w14="http://schemas.microsoft.com/office/word/2010/wordml" xmlns:w15="http://schemas.microsoft.com/office/word/2012/wordml" xmlns:w16cei="http://schemas.microsoft.com/office/word/2026/wordml/cei" xmlns:w16cex="http://schemas.microsoft.com/office/word/2018/wordml/cex" xmlns:w16cid="http://schemas.microsoft.com/office/word/2016/wordml/cid" xmlns:w16="http://schemas.microsoft.com/office/word/2018/wordml" xmlns:w16du="http://schemas.microsoft.com/office/word/2023/wordml/word16du" xmlns:w16sdtdh="http://schemas.microsoft.com/office/word/2020/wordml/sdtdatahash" xmlns:w16sdtfl="http://schemas.microsoft.com/office/word/2024/wordml/sdtformatlock" xmlns:w16se="http://schemas.microsoft.com/office/word/2015/wordml/symex" xmlns:wpg="http://schemas.microsoft.com/office/word/2010/wordprocessingGroup" xmlns:wpi="http://schemas.microsoft.com/office/word/2010/wordprocessingInk" xmlns:wne="http://schemas.microsoft.com/office/word/2006/wordml" xmlns:wps="http://schemas.microsoft.com/office/word/2010/wordprocessingShape" mc:Ignorable="w14 w15 w16se w16cid w16 w16cex w16sdtdh w16sdtfl w16du wp14">
+  <w:comment w:id="252" w:author="Druckenmueller, Marc" w:date="2026-08-07T14:28:00Z" w:initials="MD">
+    <w:p>
+      <w:pPr>
+        <w:pStyle w:val="CommentText"/>
+      </w:pPr>
+      <w:r>
+        <w:rPr>
+          <w:rStyle w:val="CommentReference"/>
+        </w:rPr>
+        <w:annotationRef/>
+      </w:r>
+      <w:r>
+        <w:t>Update OID according to PCD registry.</w:t>
+      </w:r>
+    </w:p>
+  </w:comment>
+</w:comments>
+</file>
+
+<file path=word/commentsExtended.xml><?xml version="1.0" encoding="utf-8"?>
+<w15:commentsEx xmlns:wpc="http://schemas.microsoft.com/office/word/2010/wordprocessingCanvas" xmlns:cx="http://schemas.microsoft.com/office/drawing/2014/chartex" xmlns:cx1="http://schemas.microsoft.com/office/drawing/2015/9/8/chartex" xmlns:cx2="http://schemas.microsoft.com/office/drawing/2015/10/21/chartex" xmlns:cx3="http://schemas.microsoft.com/office/drawing/2016/5/9/chartex" xmlns:cx4="http://schemas.microsoft.com/office/drawing/2016/5/10/chartex" xmlns:cx5="http://schemas.microsoft.com/office/drawing/2016/5/11/chartex" xmlns:cx6="http://schemas.microsoft.com/office/drawing/2016/5/12/chartex" xmlns:cx7="http://schemas.microsoft.com/office/drawing/2016/5/13/chartex" xmlns:cx8="http://schemas.microsoft.com/office/drawing/2016/5/14/chartex" xmlns:mc="http://schemas.openxmlformats.org/markup-compatibility/2006" xmlns:aink="http://schemas.microsoft.com/office/drawing/2016/ink" xmlns:am3d="http://schemas.microsoft.com/office/drawing/2017/model3d" xmlns:o="urn:schemas-microsoft-com:office:office" xmlns:oel="http://schemas.microsoft.com/office/2019/extlst" xmlns:r="http://schemas.openxmlformats.org/officeDocument/2006/relationships" xmlns:m="http://schemas.openxmlformats.org/officeDocument/2006/math" xmlns:v="urn:schemas-microsoft-com:vml" xmlns:wp14="http://schemas.microsoft.com/office/word/2010/wordprocessingDrawing" xmlns:wp="http://schemas.openxmlformats.org/drawingml/2006/wordprocessingDrawing" xmlns:w10="urn:schemas-microsoft-com:office:word" xmlns:w="http://schemas.openxmlformats.org/wordprocessingml/2006/main" xmlns:w14="http://schemas.microsoft.com/office/word/2010/wordml" xmlns:w15="http://schemas.microsoft.com/office/word/2012/wordml" xmlns:w16cei="http://schemas.microsoft.com/office/word/2026/wordml/cei" xmlns:w16cex="http://schemas.microsoft.com/office/word/2018/wordml/cex" xmlns:w16cid="http://schemas.microsoft.com/office/word/2016/wordml/cid" xmlns:w16="http://schemas.microsoft.com/office/word/2018/wordml" xmlns:w16du="http://schemas.microsoft.com/office/word/2023/wordml/word16du" xmlns:w16sdtdh="http://schemas.microsoft.com/office/word/2020/wordml/sdtdatahash" xmlns:w16sdtfl="http://schemas.microsoft.com/office/word/2024/wordml/sdtformatlock" xmlns:w16se="http://schemas.microsoft.com/office/word/2015/wordml/symex" xmlns:wpg="http://schemas.microsoft.com/office/word/2010/wordprocessingGroup" xmlns:wpi="http://schemas.microsoft.com/office/word/2010/wordprocessingInk" xmlns:wne="http://schemas.microsoft.com/office/word/2006/wordml" xmlns:wps="http://schemas.microsoft.com/office/word/2010/wordprocessingShape" mc:Ignorable="w14 w15 w16se w16cid w16 w16cex w16sdtdh w16sdtfl w16du wp14">
+  <w15:commentEx w15:paraId="2CB72E18" w15:done="0"/>
+</w15:commentsEx>
+</file>
+
+<file path=word/commentsExtensible.xml><?xml version="1.0" encoding="utf-8"?>
+<w16cex:commentsExtensible xmlns:wpc="http://schemas.microsoft.com/office/word/2010/wordprocessingCanvas" xmlns:cx="http://schemas.microsoft.com/office/drawing/2014/chartex" xmlns:cx1="http://schemas.microsoft.com/office/drawing/2015/9/8/chartex" xmlns:cx2="http://schemas.microsoft.com/office/drawing/2015/10/21/chartex" xmlns:cx3="http://schemas.microsoft.com/office/drawing/2016/5/9/chartex" xmlns:cx4="http://schemas.microsoft.com/office/drawing/2016/5/10/chartex" xmlns:cx5="http://schemas.microsoft.com/office/drawing/2016/5/11/chartex" xmlns:cx6="http://schemas.microsoft.com/office/drawing/2016/5/12/chartex" xmlns:cx7="http://schemas.microsoft.com/office/drawing/2016/5/13/chartex" xmlns:cx8="http://schemas.microsoft.com/office/drawing/2016/5/14/chartex" xmlns:cr="http://schemas.microsoft.com/office/comments/2020/reactions" xmlns:mc="http://schemas.openxmlformats.org/markup-compatibility/2006" xmlns:aink="http://schemas.microsoft.com/office/drawing/2016/ink" xmlns:am3d="http://schemas.microsoft.com/office/drawing/2017/model3d" xmlns:o="urn:schemas-microsoft-com:office:office" xmlns:oel="http://schemas.microsoft.com/office/2019/extlst" xmlns:r="http://schemas.openxmlformats.org/officeDocument/2006/relationships" xmlns:m="http://schemas.openxmlformats.org/officeDocument/2006/math" xmlns:v="urn:schemas-microsoft-com:vml" xmlns:wp14="http://schemas.microsoft.com/office/word/2010/wordprocessingDrawing" xmlns:wp="http://schemas.openxmlformats.org/drawingml/2006/wordprocessingDrawing" xmlns:w10="urn:schemas-microsoft-com:office:word" xmlns:w="http://schemas.openxmlformats.org/wordprocessingml/2006/main" xmlns:w14="http://schemas.microsoft.com/office/word/2010/wordml" xmlns:w15="http://schemas.microsoft.com/office/word/2012/wordml" xmlns:w16cei="http://schemas.microsoft.com/office/word/2026/wordml/cei" xmlns:w16cex="http://schemas.microsoft.com/office/word/2018/wordml/cex" xmlns:w16cid="http://schemas.microsoft.com/office/word/2016/wordml/cid" xmlns:w16="http://schemas.microsoft.com/office/word/2018/wordml" xmlns:w16du="http://schemas.microsoft.com/office/word/2023/wordml/word16du" xmlns:w16sdtdh="http://schemas.microsoft.com/office/word/2020/wordml/sdtdatahash" xmlns:w16sdtfl="http://schemas.microsoft.com/office/word/2024/wordml/sdtformatlock" xmlns:w16se="http://schemas.microsoft.com/office/word/2015/wordml/symex" xmlns:wpg="http://schemas.microsoft.com/office/word/2010/wordprocessingGroup" xmlns:wpi="http://schemas.microsoft.com/office/word/2010/wordprocessingInk" xmlns:wne="http://schemas.microsoft.com/office/word/2006/wordml" xmlns:wps="http://schemas.microsoft.com/office/word/2010/wordprocessingShape" mc:Ignorable="w14 w15 w16se w16cid w16 w16cex w16sdtdh w16sdtfl cr w16du wp14">
+  <w16cex:commentExtensible w16cex:durableId="6E709965" w16cex:dateUtc="2026-08-07T12:28:00Z"/>
+</w16cex:commentsExtensible>
+</file>
+
+<file path=word/commentsIds.xml><?xml version="1.0" encoding="utf-8"?>
+<w16cid:commentsIds xmlns:wpc="http://schemas.microsoft.com/office/word/2010/wordprocessingCanvas" xmlns:cx="http://schemas.microsoft.com/office/drawing/2014/chartex" xmlns:cx1="http://schemas.microsoft.com/office/drawing/2015/9/8/chartex" xmlns:cx2="http://schemas.microsoft.com/office/drawing/2015/10/21/chartex" xmlns:cx3="http://schemas.microsoft.com/office/drawing/2016/5/9/chartex" xmlns:cx4="http://schemas.microsoft.com/office/drawing/2016/5/10/chartex" xmlns:cx5="http://schemas.microsoft.com/office/drawing/2016/5/11/chartex" xmlns:cx6="http://schemas.microsoft.com/office/drawing/2016/5/12/chartex" xmlns:cx7="http://schemas.microsoft.com/office/drawing/2016/5/13/chartex" xmlns:cx8="http://schemas.microsoft.com/office/drawing/2016/5/14/chartex" xmlns:mc="http://schemas.openxmlformats.org/markup-compatibility/2006" xmlns:aink="http://schemas.microsoft.com/office/drawing/2016/ink" xmlns:am3d="http://schemas.microsoft.com/office/drawing/2017/model3d" xmlns:o="urn:schemas-microsoft-com:office:office" xmlns:oel="http://schemas.microsoft.com/office/2019/extlst" xmlns:r="http://schemas.openxmlformats.org/officeDocument/2006/relationships" xmlns:m="http://schemas.openxmlformats.org/officeDocument/2006/math" xmlns:v="urn:schemas-microsoft-com:vml" xmlns:wp14="http://schemas.microsoft.com/office/word/2010/wordprocessingDrawing" xmlns:wp="http://schemas.openxmlformats.org/drawingml/2006/wordprocessingDrawing" xmlns:w10="urn:schemas-microsoft-com:office:word" xmlns:w="http://schemas.openxmlformats.org/wordprocessingml/2006/main" xmlns:w14="http://schemas.microsoft.com/office/word/2010/wordml" xmlns:w15="http://schemas.microsoft.com/office/word/2012/wordml" xmlns:w16cei="http://schemas.microsoft.com/office/word/2026/wordml/cei" xmlns:w16cex="http://schemas.microsoft.com/office/word/2018/wordml/cex" xmlns:w16cid="http://schemas.microsoft.com/office/word/2016/wordml/cid" xmlns:w16="http://schemas.microsoft.com/office/word/2018/wordml" xmlns:w16du="http://schemas.microsoft.com/office/word/2023/wordml/word16du" xmlns:w16sdtdh="http://schemas.microsoft.com/office/word/2020/wordml/sdtdatahash" xmlns:w16sdtfl="http://schemas.microsoft.com/office/word/2024/wordml/sdtformatlock" xmlns:w16se="http://schemas.microsoft.com/office/word/2015/wordml/symex" xmlns:wpg="http://schemas.microsoft.com/office/word/2010/wordprocessingGroup" xmlns:wpi="http://schemas.microsoft.com/office/word/2010/wordprocessingInk" xmlns:wne="http://schemas.microsoft.com/office/word/2006/wordml" xmlns:wps="http://schemas.microsoft.com/office/word/2010/wordprocessingShape" mc:Ignorable="w14 w15 w16se w16cid w16 w16cex w16sdtdh w16sdtfl w16du wp14">
+  <w16cid:commentId w16cid:paraId="2CB72E18" w16cid:durableId="6E709965"/>
+</w16cid:commentsIds>
+</file>
+
 <file path=word/endnotes.xml><?xml version="1.0" encoding="utf-8"?>
-<w:endnotes xmlns:wpc="http://schemas.microsoft.com/office/word/2010/wordprocessingCanvas" xmlns:cx="http://schemas.microsoft.com/office/drawing/2014/chartex" xmlns:cx1="http://schemas.microsoft.com/office/drawing/2015/9/8/chartex" xmlns:cx2="http://schemas.microsoft.com/office/drawing/2015/10/21/chartex" xmlns:cx3="http://schemas.microsoft.com/office/drawing/2016/5/9/chartex" xmlns:cx4="http://schemas.microsoft.com/office/drawing/2016/5/10/chartex" xmlns:cx5="http://schemas.microsoft.com/office/drawing/2016/5/11/chartex" xmlns:cx6="http://schemas.microsoft.com/office/drawing/2016/5/12/chartex" xmlns:cx7="http://schemas.microsoft.com/office/drawing/2016/5/13/chartex" xmlns:cx8="http://schemas.microsoft.com/office/drawing/2016/5/14/chartex" xmlns:mc="http://schemas.openxmlformats.org/markup-compatibility/2006" xmlns:aink="http://schemas.microsoft.com/office/drawing/2016/ink" xmlns:am3d="http://schemas.microsoft.com/office/drawing/2017/model3d" xmlns:o="urn:schemas-microsoft-com:office:office" xmlns:oel="http://schemas.microsoft.com/office/2019/extlst" xmlns:r="http://schemas.openxmlformats.org/officeDocument/2006/relationships" xmlns:m="http://schemas.openxmlformats.org/officeDocument/2006/math" xmlns:v="urn:schemas-microsoft-com:vml" xmlns:wp14="http://schemas.microsoft.com/office/word/2010/wordprocessingDrawing" xmlns:wp="http://schemas.openxmlformats.org/drawingml/2006/wordprocessingDrawing" xmlns:w10="urn:schemas-microsoft-com:office:word" xmlns:w="http://schemas.openxmlformats.org/wordprocessingml/2006/main" xmlns:w14="http://schemas.microsoft.com/office/word/2010/wordml" xmlns:w15="http://schemas.microsoft.com/office/word/2012/wordml" xmlns:w16cex="http://schemas.microsoft.com/office/word/2018/wordml/cex" xmlns:w16cid="http://schemas.microsoft.com/office/word/2016/wordml/cid" xmlns:w16="http://schemas.microsoft.com/office/word/2018/wordml" xmlns:w16du="http://schemas.microsoft.com/office/word/2023/wordml/word16du" xmlns:w16sdtdh="http://schemas.microsoft.com/office/word/2020/wordml/sdtdatahash" xmlns:w16sdtfl="http://schemas.microsoft.com/office/word/2024/wordml/sdtformatlock" xmlns:w16se="http://schemas.microsoft.com/office/word/2015/wordml/symex" xmlns:wpg="http://schemas.microsoft.com/office/word/2010/wordprocessingGroup" xmlns:wpi="http://schemas.microsoft.com/office/word/2010/wordprocessingInk" xmlns:wne="http://schemas.microsoft.com/office/word/2006/wordml" xmlns:wps="http://schemas.microsoft.com/office/word/2010/wordprocessingShape" mc:Ignorable="w14 w15 w16se w16cid w16 w16cex w16sdtdh w16sdtfl w16du wp14">
+<w:endnotes xmlns:wpc="http://schemas.microsoft.com/office/word/2010/wordprocessingCanvas" xmlns:cx="http://schemas.microsoft.com/office/drawing/2014/chartex" xmlns:cx1="http://schemas.microsoft.com/office/drawing/2015/9/8/chartex" xmlns:cx2="http://schemas.microsoft.com/office/drawing/2015/10/21/chartex" xmlns:cx3="http://schemas.microsoft.com/office/drawing/2016/5/9/chartex" xmlns:cx4="http://schemas.microsoft.com/office/drawing/2016/5/10/chartex" xmlns:cx5="http://schemas.microsoft.com/office/drawing/2016/5/11/chartex" xmlns:cx6="http://schemas.microsoft.com/office/drawing/2016/5/12/chartex" xmlns:cx7="http://schemas.microsoft.com/office/drawing/2016/5/13/chartex" xmlns:cx8="http://schemas.microsoft.com/office/drawing/2016/5/14/chartex" xmlns:mc="http://schemas.openxmlformats.org/markup-compatibility/2006" xmlns:aink="http://schemas.microsoft.com/office/drawing/2016/ink" xmlns:am3d="http://schemas.microsoft.com/office/drawing/2017/model3d" xmlns:o="urn:schemas-microsoft-com:office:office" xmlns:oel="http://schemas.microsoft.com/office/2019/extlst" xmlns:r="http://schemas.openxmlformats.org/officeDocument/2006/relationships" xmlns:m="http://schemas.openxmlformats.org/officeDocument/2006/math" xmlns:v="urn:schemas-microsoft-com:vml" xmlns:wp14="http://schemas.microsoft.com/office/word/2010/wordprocessingDrawing" xmlns:wp="http://schemas.openxmlformats.org/drawingml/2006/wordprocessingDrawing" xmlns:w10="urn:schemas-microsoft-com:office:word" xmlns:w="http://schemas.openxmlformats.org/wordprocessingml/2006/main" xmlns:w14="http://schemas.microsoft.com/office/word/2010/wordml" xmlns:w15="http://schemas.microsoft.com/office/word/2012/wordml" xmlns:w16cei="http://schemas.microsoft.com/office/word/2026/wordml/cei" xmlns:w16cex="http://schemas.microsoft.com/office/word/2018/wordml/cex" xmlns:w16cid="http://schemas.microsoft.com/office/word/2016/wordml/cid" xmlns:w16="http://schemas.microsoft.com/office/word/2018/wordml" xmlns:w16du="http://schemas.microsoft.com/office/word/2023/wordml/word16du" xmlns:w16sdtdh="http://schemas.microsoft.com/office/word/2020/wordml/sdtdatahash" xmlns:w16sdtfl="http://schemas.microsoft.com/office/word/2024/wordml/sdtformatlock" xmlns:w16se="http://schemas.microsoft.com/office/word/2015/wordml/symex" xmlns:wpg="http://schemas.microsoft.com/office/word/2010/wordprocessingGroup" xmlns:wpi="http://schemas.microsoft.com/office/word/2010/wordprocessingInk" xmlns:wne="http://schemas.microsoft.com/office/word/2006/wordml" xmlns:wps="http://schemas.microsoft.com/office/word/2010/wordprocessingShape" mc:Ignorable="w14 w15 w16se w16cid w16 w16cex w16sdtdh w16sdtfl w16du wp14">
   <w:endnote w:type="separator" w:id="-1">
     <w:p>
       <w:r>
@@ -19522,7 +19578,7 @@
 </file>
 
 <file path=word/footer1.xml><?xml version="1.0" encoding="utf-8"?>
-<w:ftr xmlns:wpc="http://schemas.microsoft.com/office/word/2010/wordprocessingCanvas" xmlns:cx="http://schemas.microsoft.com/office/drawing/2014/chartex" xmlns:cx1="http://schemas.microsoft.com/office/drawing/2015/9/8/chartex" xmlns:cx2="http://schemas.microsoft.com/office/drawing/2015/10/21/chartex" xmlns:cx3="http://schemas.microsoft.com/office/drawing/2016/5/9/chartex" xmlns:cx4="http://schemas.microsoft.com/office/drawing/2016/5/10/chartex" xmlns:cx5="http://schemas.microsoft.com/office/drawing/2016/5/11/chartex" xmlns:cx6="http://schemas.microsoft.com/office/drawing/2016/5/12/chartex" xmlns:cx7="http://schemas.microsoft.com/office/drawing/2016/5/13/chartex" xmlns:cx8="http://schemas.microsoft.com/office/drawing/2016/5/14/chartex" xmlns:mc="http://schemas.openxmlformats.org/markup-compatibility/2006" xmlns:aink="http://schemas.microsoft.com/office/drawing/2016/ink" xmlns:am3d="http://schemas.microsoft.com/office/drawing/2017/model3d" xmlns:o="urn:schemas-microsoft-com:office:office" xmlns:oel="http://schemas.microsoft.com/office/2019/extlst" xmlns:r="http://schemas.openxmlformats.org/officeDocument/2006/relationships" xmlns:m="http://schemas.openxmlformats.org/officeDocument/2006/math" xmlns:v="urn:schemas-microsoft-com:vml" xmlns:wp14="http://schemas.microsoft.com/office/word/2010/wordprocessingDrawing" xmlns:wp="http://schemas.openxmlformats.org/drawingml/2006/wordprocessingDrawing" xmlns:w10="urn:schemas-microsoft-com:office:word" xmlns:w="http://schemas.openxmlformats.org/wordprocessingml/2006/main" xmlns:w14="http://schemas.microsoft.com/office/word/2010/wordml" xmlns:w15="http://schemas.microsoft.com/office/word/2012/wordml" xmlns:w16cex="http://schemas.microsoft.com/office/word/2018/wordml/cex" xmlns:w16cid="http://schemas.microsoft.com/office/word/2016/wordml/cid" xmlns:w16="http://schemas.microsoft.com/office/word/2018/wordml" xmlns:w16du="http://schemas.microsoft.com/office/word/2023/wordml/word16du" xmlns:w16sdtdh="http://schemas.microsoft.com/office/word/2020/wordml/sdtdatahash" xmlns:w16sdtfl="http://schemas.microsoft.com/office/word/2024/wordml/sdtformatlock" xmlns:w16se="http://schemas.microsoft.com/office/word/2015/wordml/symex" xmlns:wpg="http://schemas.microsoft.com/office/word/2010/wordprocessingGroup" xmlns:wpi="http://schemas.microsoft.com/office/word/2010/wordprocessingInk" xmlns:wne="http://schemas.microsoft.com/office/word/2006/wordml" xmlns:wps="http://schemas.microsoft.com/office/word/2010/wordprocessingShape" mc:Ignorable="w14 w15 w16se w16cid w16 w16cex w16sdtdh w16sdtfl w16du wp14">
+<w:ftr xmlns:wpc="http://schemas.microsoft.com/office/word/2010/wordprocessingCanvas" xmlns:cx="http://schemas.microsoft.com/office/drawing/2014/chartex" xmlns:cx1="http://schemas.microsoft.com/office/drawing/2015/9/8/chartex" xmlns:cx2="http://schemas.microsoft.com/office/drawing/2015/10/21/chartex" xmlns:cx3="http://schemas.microsoft.com/office/drawing/2016/5/9/chartex" xmlns:cx4="http://schemas.microsoft.com/office/drawing/2016/5/10/chartex" xmlns:cx5="http://schemas.microsoft.com/office/drawing/2016/5/11/chartex" xmlns:cx6="http://schemas.microsoft.com/office/drawing/2016/5/12/chartex" xmlns:cx7="http://schemas.microsoft.com/office/drawing/2016/5/13/chartex" xmlns:cx8="http://schemas.microsoft.com/office/drawing/2016/5/14/chartex" xmlns:mc="http://schemas.openxmlformats.org/markup-compatibility/2006" xmlns:aink="http://schemas.microsoft.com/office/drawing/2016/ink" xmlns:am3d="http://schemas.microsoft.com/office/drawing/2017/model3d" xmlns:o="urn:schemas-microsoft-com:office:office" xmlns:oel="http://schemas.microsoft.com/office/2019/extlst" xmlns:r="http://schemas.openxmlformats.org/officeDocument/2006/relationships" xmlns:m="http://schemas.openxmlformats.org/officeDocument/2006/math" xmlns:v="urn:schemas-microsoft-com:vml" xmlns:wp14="http://schemas.microsoft.com/office/word/2010/wordprocessingDrawing" xmlns:wp="http://schemas.openxmlformats.org/drawingml/2006/wordprocessingDrawing" xmlns:w10="urn:schemas-microsoft-com:office:word" xmlns:w="http://schemas.openxmlformats.org/wordprocessingml/2006/main" xmlns:w14="http://schemas.microsoft.com/office/word/2010/wordml" xmlns:w15="http://schemas.microsoft.com/office/word/2012/wordml" xmlns:w16cei="http://schemas.microsoft.com/office/word/2026/wordml/cei" xmlns:w16cex="http://schemas.microsoft.com/office/word/2018/wordml/cex" xmlns:w16cid="http://schemas.microsoft.com/office/word/2016/wordml/cid" xmlns:w16="http://schemas.microsoft.com/office/word/2018/wordml" xmlns:w16du="http://schemas.microsoft.com/office/word/2023/wordml/word16du" xmlns:w16sdtdh="http://schemas.microsoft.com/office/word/2020/wordml/sdtdatahash" xmlns:w16sdtfl="http://schemas.microsoft.com/office/word/2024/wordml/sdtformatlock" xmlns:w16se="http://schemas.microsoft.com/office/word/2015/wordml/symex" xmlns:wpg="http://schemas.microsoft.com/office/word/2010/wordprocessingGroup" xmlns:wpi="http://schemas.microsoft.com/office/word/2010/wordprocessingInk" xmlns:wne="http://schemas.microsoft.com/office/word/2006/wordml" xmlns:wps="http://schemas.microsoft.com/office/word/2010/wordprocessingShape" mc:Ignorable="w14 w15 w16se w16cid w16 w16cex w16sdtdh w16sdtfl w16du wp14">
   <w:p>
     <w:pPr>
       <w:pStyle w:val="Footer"/>
@@ -19573,7 +19629,7 @@
 </file>
 
 <file path=word/footer2.xml><?xml version="1.0" encoding="utf-8"?>
-<w:ftr xmlns:wpc="http://schemas.microsoft.com/office/word/2010/wordprocessingCanvas" xmlns:cx="http://schemas.microsoft.com/office/drawing/2014/chartex" xmlns:cx1="http://schemas.microsoft.com/office/drawing/2015/9/8/chartex" xmlns:cx2="http://schemas.microsoft.com/office/drawing/2015/10/21/chartex" xmlns:cx3="http://schemas.microsoft.com/office/drawing/2016/5/9/chartex" xmlns:cx4="http://schemas.microsoft.com/office/drawing/2016/5/10/chartex" xmlns:cx5="http://schemas.microsoft.com/office/drawing/2016/5/11/chartex" xmlns:cx6="http://schemas.microsoft.com/office/drawing/2016/5/12/chartex" xmlns:cx7="http://schemas.microsoft.com/office/drawing/2016/5/13/chartex" xmlns:cx8="http://schemas.microsoft.com/office/drawing/2016/5/14/chartex" xmlns:mc="http://schemas.openxmlformats.org/markup-compatibility/2006" xmlns:aink="http://schemas.microsoft.com/office/drawing/2016/ink" xmlns:am3d="http://schemas.microsoft.com/office/drawing/2017/model3d" xmlns:o="urn:schemas-microsoft-com:office:office" xmlns:oel="http://schemas.microsoft.com/office/2019/extlst" xmlns:r="http://schemas.openxmlformats.org/officeDocument/2006/relationships" xmlns:m="http://schemas.openxmlformats.org/officeDocument/2006/math" xmlns:v="urn:schemas-microsoft-com:vml" xmlns:wp14="http://schemas.microsoft.com/office/word/2010/wordprocessingDrawing" xmlns:wp="http://schemas.openxmlformats.org/drawingml/2006/wordprocessingDrawing" xmlns:w10="urn:schemas-microsoft-com:office:word" xmlns:w="http://schemas.openxmlformats.org/wordprocessingml/2006/main" xmlns:w14="http://schemas.microsoft.com/office/word/2010/wordml" xmlns:w15="http://schemas.microsoft.com/office/word/2012/wordml" xmlns:w16cex="http://schemas.microsoft.com/office/word/2018/wordml/cex" xmlns:w16cid="http://schemas.microsoft.com/office/word/2016/wordml/cid" xmlns:w16="http://schemas.microsoft.com/office/word/2018/wordml" xmlns:w16du="http://schemas.microsoft.com/office/word/2023/wordml/word16du" xmlns:w16sdtdh="http://schemas.microsoft.com/office/word/2020/wordml/sdtdatahash" xmlns:w16sdtfl="http://schemas.microsoft.com/office/word/2024/wordml/sdtformatlock" xmlns:w16se="http://schemas.microsoft.com/office/word/2015/wordml/symex" xmlns:wpg="http://schemas.microsoft.com/office/word/2010/wordprocessingGroup" xmlns:wpi="http://schemas.microsoft.com/office/word/2010/wordprocessingInk" xmlns:wne="http://schemas.microsoft.com/office/word/2006/wordml" xmlns:wps="http://schemas.microsoft.com/office/word/2010/wordprocessingShape" mc:Ignorable="w14 w15 w16se w16cid w16 w16cex w16sdtdh w16sdtfl w16du wp14">
+<w:ftr xmlns:wpc="http://schemas.microsoft.com/office/word/2010/wordprocessingCanvas" xmlns:cx="http://schemas.microsoft.com/office/drawing/2014/chartex" xmlns:cx1="http://schemas.microsoft.com/office/drawing/2015/9/8/chartex" xmlns:cx2="http://schemas.microsoft.com/office/drawing/2015/10/21/chartex" xmlns:cx3="http://schemas.microsoft.com/office/drawing/2016/5/9/chartex" xmlns:cx4="http://schemas.microsoft.com/office/drawing/2016/5/10/chartex" xmlns:cx5="http://schemas.microsoft.com/office/drawing/2016/5/11/chartex" xmlns:cx6="http://schemas.microsoft.com/office/drawing/2016/5/12/chartex" xmlns:cx7="http://schemas.microsoft.com/office/drawing/2016/5/13/chartex" xmlns:cx8="http://schemas.microsoft.com/office/drawing/2016/5/14/chartex" xmlns:mc="http://schemas.openxmlformats.org/markup-compatibility/2006" xmlns:aink="http://schemas.microsoft.com/office/drawing/2016/ink" xmlns:am3d="http://schemas.microsoft.com/office/drawing/2017/model3d" xmlns:o="urn:schemas-microsoft-com:office:office" xmlns:oel="http://schemas.microsoft.com/office/2019/extlst" xmlns:r="http://schemas.openxmlformats.org/officeDocument/2006/relationships" xmlns:m="http://schemas.openxmlformats.org/officeDocument/2006/math" xmlns:v="urn:schemas-microsoft-com:vml" xmlns:wp14="http://schemas.microsoft.com/office/word/2010/wordprocessingDrawing" xmlns:wp="http://schemas.openxmlformats.org/drawingml/2006/wordprocessingDrawing" xmlns:w10="urn:schemas-microsoft-com:office:word" xmlns:w="http://schemas.openxmlformats.org/wordprocessingml/2006/main" xmlns:w14="http://schemas.microsoft.com/office/word/2010/wordml" xmlns:w15="http://schemas.microsoft.com/office/word/2012/wordml" xmlns:w16cei="http://schemas.microsoft.com/office/word/2026/wordml/cei" xmlns:w16cex="http://schemas.microsoft.com/office/word/2018/wordml/cex" xmlns:w16cid="http://schemas.microsoft.com/office/word/2016/wordml/cid" xmlns:w16="http://schemas.microsoft.com/office/word/2018/wordml" xmlns:w16du="http://schemas.microsoft.com/office/word/2023/wordml/word16du" xmlns:w16sdtdh="http://schemas.microsoft.com/office/word/2020/wordml/sdtdatahash" xmlns:w16sdtfl="http://schemas.microsoft.com/office/word/2024/wordml/sdtformatlock" xmlns:w16se="http://schemas.microsoft.com/office/word/2015/wordml/symex" xmlns:wpg="http://schemas.microsoft.com/office/word/2010/wordprocessingGroup" xmlns:wpi="http://schemas.microsoft.com/office/word/2010/wordprocessingInk" xmlns:wne="http://schemas.microsoft.com/office/word/2006/wordml" xmlns:wps="http://schemas.microsoft.com/office/word/2010/wordprocessingShape" mc:Ignorable="w14 w15 w16se w16cid w16 w16cex w16sdtdh w16sdtfl w16du wp14">
   <w:p>
     <w:pPr>
       <w:pStyle w:val="Footer"/>
@@ -19591,7 +19647,7 @@
         <w:sz w:val="20"/>
       </w:rPr>
     </w:pPr>
-    <w:bookmarkStart w:id="260" w:name="_Toc473170355"/>
+    <w:bookmarkStart w:id="263" w:name="_Toc473170355"/>
     <w:r>
       <w:rPr>
         <w:sz w:val="20"/>
@@ -19707,7 +19763,7 @@
       </w:rPr>
       <w:t>: IHE International, Inc.</w:t>
     </w:r>
-    <w:bookmarkEnd w:id="260"/>
+    <w:bookmarkEnd w:id="263"/>
   </w:p>
   <w:p>
     <w:pPr>
@@ -19758,7 +19814,7 @@
 </file>
 
 <file path=word/footer3.xml><?xml version="1.0" encoding="utf-8"?>
-<w:ftr xmlns:wpc="http://schemas.microsoft.com/office/word/2010/wordprocessingCanvas" xmlns:cx="http://schemas.microsoft.com/office/drawing/2014/chartex" xmlns:cx1="http://schemas.microsoft.com/office/drawing/2015/9/8/chartex" xmlns:cx2="http://schemas.microsoft.com/office/drawing/2015/10/21/chartex" xmlns:cx3="http://schemas.microsoft.com/office/drawing/2016/5/9/chartex" xmlns:cx4="http://schemas.microsoft.com/office/drawing/2016/5/10/chartex" xmlns:cx5="http://schemas.microsoft.com/office/drawing/2016/5/11/chartex" xmlns:cx6="http://schemas.microsoft.com/office/drawing/2016/5/12/chartex" xmlns:cx7="http://schemas.microsoft.com/office/drawing/2016/5/13/chartex" xmlns:cx8="http://schemas.microsoft.com/office/drawing/2016/5/14/chartex" xmlns:mc="http://schemas.openxmlformats.org/markup-compatibility/2006" xmlns:aink="http://schemas.microsoft.com/office/drawing/2016/ink" xmlns:am3d="http://schemas.microsoft.com/office/drawing/2017/model3d" xmlns:o="urn:schemas-microsoft-com:office:office" xmlns:oel="http://schemas.microsoft.com/office/2019/extlst" xmlns:r="http://schemas.openxmlformats.org/officeDocument/2006/relationships" xmlns:m="http://schemas.openxmlformats.org/officeDocument/2006/math" xmlns:v="urn:schemas-microsoft-com:vml" xmlns:wp14="http://schemas.microsoft.com/office/word/2010/wordprocessingDrawing" xmlns:wp="http://schemas.openxmlformats.org/drawingml/2006/wordprocessingDrawing" xmlns:w10="urn:schemas-microsoft-com:office:word" xmlns:w="http://schemas.openxmlformats.org/wordprocessingml/2006/main" xmlns:w14="http://schemas.microsoft.com/office/word/2010/wordml" xmlns:w15="http://schemas.microsoft.com/office/word/2012/wordml" xmlns:w16cex="http://schemas.microsoft.com/office/word/2018/wordml/cex" xmlns:w16cid="http://schemas.microsoft.com/office/word/2016/wordml/cid" xmlns:w16="http://schemas.microsoft.com/office/word/2018/wordml" xmlns:w16du="http://schemas.microsoft.com/office/word/2023/wordml/word16du" xmlns:w16sdtdh="http://schemas.microsoft.com/office/word/2020/wordml/sdtdatahash" xmlns:w16sdtfl="http://schemas.microsoft.com/office/word/2024/wordml/sdtformatlock" xmlns:w16se="http://schemas.microsoft.com/office/word/2015/wordml/symex" xmlns:wpg="http://schemas.microsoft.com/office/word/2010/wordprocessingGroup" xmlns:wpi="http://schemas.microsoft.com/office/word/2010/wordprocessingInk" xmlns:wne="http://schemas.microsoft.com/office/word/2006/wordml" xmlns:wps="http://schemas.microsoft.com/office/word/2010/wordprocessingShape" mc:Ignorable="w14 w15 w16se w16cid w16 w16cex w16sdtdh w16sdtfl w16du wp14">
+<w:ftr xmlns:wpc="http://schemas.microsoft.com/office/word/2010/wordprocessingCanvas" xmlns:cx="http://schemas.microsoft.com/office/drawing/2014/chartex" xmlns:cx1="http://schemas.microsoft.com/office/drawing/2015/9/8/chartex" xmlns:cx2="http://schemas.microsoft.com/office/drawing/2015/10/21/chartex" xmlns:cx3="http://schemas.microsoft.com/office/drawing/2016/5/9/chartex" xmlns:cx4="http://schemas.microsoft.com/office/drawing/2016/5/10/chartex" xmlns:cx5="http://schemas.microsoft.com/office/drawing/2016/5/11/chartex" xmlns:cx6="http://schemas.microsoft.com/office/drawing/2016/5/12/chartex" xmlns:cx7="http://schemas.microsoft.com/office/drawing/2016/5/13/chartex" xmlns:cx8="http://schemas.microsoft.com/office/drawing/2016/5/14/chartex" xmlns:mc="http://schemas.openxmlformats.org/markup-compatibility/2006" xmlns:aink="http://schemas.microsoft.com/office/drawing/2016/ink" xmlns:am3d="http://schemas.microsoft.com/office/drawing/2017/model3d" xmlns:o="urn:schemas-microsoft-com:office:office" xmlns:oel="http://schemas.microsoft.com/office/2019/extlst" xmlns:r="http://schemas.openxmlformats.org/officeDocument/2006/relationships" xmlns:m="http://schemas.openxmlformats.org/officeDocument/2006/math" xmlns:v="urn:schemas-microsoft-com:vml" xmlns:wp14="http://schemas.microsoft.com/office/word/2010/wordprocessingDrawing" xmlns:wp="http://schemas.openxmlformats.org/drawingml/2006/wordprocessingDrawing" xmlns:w10="urn:schemas-microsoft-com:office:word" xmlns:w="http://schemas.openxmlformats.org/wordprocessingml/2006/main" xmlns:w14="http://schemas.microsoft.com/office/word/2010/wordml" xmlns:w15="http://schemas.microsoft.com/office/word/2012/wordml" xmlns:w16cei="http://schemas.microsoft.com/office/word/2026/wordml/cei" xmlns:w16cex="http://schemas.microsoft.com/office/word/2018/wordml/cex" xmlns:w16cid="http://schemas.microsoft.com/office/word/2016/wordml/cid" xmlns:w16="http://schemas.microsoft.com/office/word/2018/wordml" xmlns:w16du="http://schemas.microsoft.com/office/word/2023/wordml/word16du" xmlns:w16sdtdh="http://schemas.microsoft.com/office/word/2020/wordml/sdtdatahash" xmlns:w16sdtfl="http://schemas.microsoft.com/office/word/2024/wordml/sdtformatlock" xmlns:w16se="http://schemas.microsoft.com/office/word/2015/wordml/symex" xmlns:wpg="http://schemas.microsoft.com/office/word/2010/wordprocessingGroup" xmlns:wpi="http://schemas.microsoft.com/office/word/2010/wordprocessingInk" xmlns:wne="http://schemas.microsoft.com/office/word/2006/wordml" xmlns:wps="http://schemas.microsoft.com/office/word/2010/wordprocessingShape" mc:Ignorable="w14 w15 w16se w16cid w16 w16cex w16sdtdh w16sdtfl w16du wp14">
   <w:p>
     <w:pPr>
       <w:pStyle w:val="Footer"/>
@@ -19787,7 +19843,7 @@
 </file>
 
 <file path=word/footnotes.xml><?xml version="1.0" encoding="utf-8"?>
-<w:footnotes xmlns:wpc="http://schemas.microsoft.com/office/word/2010/wordprocessingCanvas" xmlns:cx="http://schemas.microsoft.com/office/drawing/2014/chartex" xmlns:cx1="http://schemas.microsoft.com/office/drawing/2015/9/8/chartex" xmlns:cx2="http://schemas.microsoft.com/office/drawing/2015/10/21/chartex" xmlns:cx3="http://schemas.microsoft.com/office/drawing/2016/5/9/chartex" xmlns:cx4="http://schemas.microsoft.com/office/drawing/2016/5/10/chartex" xmlns:cx5="http://schemas.microsoft.com/office/drawing/2016/5/11/chartex" xmlns:cx6="http://schemas.microsoft.com/office/drawing/2016/5/12/chartex" xmlns:cx7="http://schemas.microsoft.com/office/drawing/2016/5/13/chartex" xmlns:cx8="http://schemas.microsoft.com/office/drawing/2016/5/14/chartex" xmlns:mc="http://schemas.openxmlformats.org/markup-compatibility/2006" xmlns:aink="http://schemas.microsoft.com/office/drawing/2016/ink" xmlns:am3d="http://schemas.microsoft.com/office/drawing/2017/model3d" xmlns:o="urn:schemas-microsoft-com:office:office" xmlns:oel="http://schemas.microsoft.com/office/2019/extlst" xmlns:r="http://schemas.openxmlformats.org/officeDocument/2006/relationships" xmlns:m="http://schemas.openxmlformats.org/officeDocument/2006/math" xmlns:v="urn:schemas-microsoft-com:vml" xmlns:wp14="http://schemas.microsoft.com/office/word/2010/wordprocessingDrawing" xmlns:wp="http://schemas.openxmlformats.org/drawingml/2006/wordprocessingDrawing" xmlns:w10="urn:schemas-microsoft-com:office:word" xmlns:w="http://schemas.openxmlformats.org/wordprocessingml/2006/main" xmlns:w14="http://schemas.microsoft.com/office/word/2010/wordml" xmlns:w15="http://schemas.microsoft.com/office/word/2012/wordml" xmlns:w16cex="http://schemas.microsoft.com/office/word/2018/wordml/cex" xmlns:w16cid="http://schemas.microsoft.com/office/word/2016/wordml/cid" xmlns:w16="http://schemas.microsoft.com/office/word/2018/wordml" xmlns:w16du="http://schemas.microsoft.com/office/word/2023/wordml/word16du" xmlns:w16sdtdh="http://schemas.microsoft.com/office/word/2020/wordml/sdtdatahash" xmlns:w16sdtfl="http://schemas.microsoft.com/office/word/2024/wordml/sdtformatlock" xmlns:w16se="http://schemas.microsoft.com/office/word/2015/wordml/symex" xmlns:wpg="http://schemas.microsoft.com/office/word/2010/wordprocessingGroup" xmlns:wpi="http://schemas.microsoft.com/office/word/2010/wordprocessingInk" xmlns:wne="http://schemas.microsoft.com/office/word/2006/wordml" xmlns:wps="http://schemas.microsoft.com/office/word/2010/wordprocessingShape" mc:Ignorable="w14 w15 w16se w16cid w16 w16cex w16sdtdh w16sdtfl w16du wp14">
+<w:footnotes xmlns:wpc="http://schemas.microsoft.com/office/word/2010/wordprocessingCanvas" xmlns:cx="http://schemas.microsoft.com/office/drawing/2014/chartex" xmlns:cx1="http://schemas.microsoft.com/office/drawing/2015/9/8/chartex" xmlns:cx2="http://schemas.microsoft.com/office/drawing/2015/10/21/chartex" xmlns:cx3="http://schemas.microsoft.com/office/drawing/2016/5/9/chartex" xmlns:cx4="http://schemas.microsoft.com/office/drawing/2016/5/10/chartex" xmlns:cx5="http://schemas.microsoft.com/office/drawing/2016/5/11/chartex" xmlns:cx6="http://schemas.microsoft.com/office/drawing/2016/5/12/chartex" xmlns:cx7="http://schemas.microsoft.com/office/drawing/2016/5/13/chartex" xmlns:cx8="http://schemas.microsoft.com/office/drawing/2016/5/14/chartex" xmlns:mc="http://schemas.openxmlformats.org/markup-compatibility/2006" xmlns:aink="http://schemas.microsoft.com/office/drawing/2016/ink" xmlns:am3d="http://schemas.microsoft.com/office/drawing/2017/model3d" xmlns:o="urn:schemas-microsoft-com:office:office" xmlns:oel="http://schemas.microsoft.com/office/2019/extlst" xmlns:r="http://schemas.openxmlformats.org/officeDocument/2006/relationships" xmlns:m="http://schemas.openxmlformats.org/officeDocument/2006/math" xmlns:v="urn:schemas-microsoft-com:vml" xmlns:wp14="http://schemas.microsoft.com/office/word/2010/wordprocessingDrawing" xmlns:wp="http://schemas.openxmlformats.org/drawingml/2006/wordprocessingDrawing" xmlns:w10="urn:schemas-microsoft-com:office:word" xmlns:w="http://schemas.openxmlformats.org/wordprocessingml/2006/main" xmlns:w14="http://schemas.microsoft.com/office/word/2010/wordml" xmlns:w15="http://schemas.microsoft.com/office/word/2012/wordml" xmlns:w16cei="http://schemas.microsoft.com/office/word/2026/wordml/cei" xmlns:w16cex="http://schemas.microsoft.com/office/word/2018/wordml/cex" xmlns:w16cid="http://schemas.microsoft.com/office/word/2016/wordml/cid" xmlns:w16="http://schemas.microsoft.com/office/word/2018/wordml" xmlns:w16du="http://schemas.microsoft.com/office/word/2023/wordml/word16du" xmlns:w16sdtdh="http://schemas.microsoft.com/office/word/2020/wordml/sdtdatahash" xmlns:w16sdtfl="http://schemas.microsoft.com/office/word/2024/wordml/sdtformatlock" xmlns:w16se="http://schemas.microsoft.com/office/word/2015/wordml/symex" xmlns:wpg="http://schemas.microsoft.com/office/word/2010/wordprocessingGroup" xmlns:wpi="http://schemas.microsoft.com/office/word/2010/wordprocessingInk" xmlns:wne="http://schemas.microsoft.com/office/word/2006/wordml" xmlns:wps="http://schemas.microsoft.com/office/word/2010/wordprocessingShape" mc:Ignorable="w14 w15 w16se w16cid w16 w16cex w16sdtdh w16sdtfl w16du wp14">
   <w:footnote w:type="separator" w:id="-1">
     <w:p>
       <w:r>
@@ -19816,7 +19872,7 @@
 </file>
 
 <file path=word/header1.xml><?xml version="1.0" encoding="utf-8"?>
-<w:hdr xmlns:wpc="http://schemas.microsoft.com/office/word/2010/wordprocessingCanvas" xmlns:cx="http://schemas.microsoft.com/office/drawing/2014/chartex" xmlns:cx1="http://schemas.microsoft.com/office/drawing/2015/9/8/chartex" xmlns:cx2="http://schemas.microsoft.com/office/drawing/2015/10/21/chartex" xmlns:cx3="http://schemas.microsoft.com/office/drawing/2016/5/9/chartex" xmlns:cx4="http://schemas.microsoft.com/office/drawing/2016/5/10/chartex" xmlns:cx5="http://schemas.microsoft.com/office/drawing/2016/5/11/chartex" xmlns:cx6="http://schemas.microsoft.com/office/drawing/2016/5/12/chartex" xmlns:cx7="http://schemas.microsoft.com/office/drawing/2016/5/13/chartex" xmlns:cx8="http://schemas.microsoft.com/office/drawing/2016/5/14/chartex" xmlns:mc="http://schemas.openxmlformats.org/markup-compatibility/2006" xmlns:aink="http://schemas.microsoft.com/office/drawing/2016/ink" xmlns:am3d="http://schemas.microsoft.com/office/drawing/2017/model3d" xmlns:o="urn:schemas-microsoft-com:office:office" xmlns:oel="http://schemas.microsoft.com/office/2019/extlst" xmlns:r="http://schemas.openxmlformats.org/officeDocument/2006/relationships" xmlns:m="http://schemas.openxmlformats.org/officeDocument/2006/math" xmlns:v="urn:schemas-microsoft-com:vml" xmlns:wp14="http://schemas.microsoft.com/office/word/2010/wordprocessingDrawing" xmlns:wp="http://schemas.openxmlformats.org/drawingml/2006/wordprocessingDrawing" xmlns:w10="urn:schemas-microsoft-com:office:word" xmlns:w="http://schemas.openxmlformats.org/wordprocessingml/2006/main" xmlns:w14="http://schemas.microsoft.com/office/word/2010/wordml" xmlns:w15="http://schemas.microsoft.com/office/word/2012/wordml" xmlns:w16cex="http://schemas.microsoft.com/office/word/2018/wordml/cex" xmlns:w16cid="http://schemas.microsoft.com/office/word/2016/wordml/cid" xmlns:w16="http://schemas.microsoft.com/office/word/2018/wordml" xmlns:w16du="http://schemas.microsoft.com/office/word/2023/wordml/word16du" xmlns:w16sdtdh="http://schemas.microsoft.com/office/word/2020/wordml/sdtdatahash" xmlns:w16sdtfl="http://schemas.microsoft.com/office/word/2024/wordml/sdtformatlock" xmlns:w16se="http://schemas.microsoft.com/office/word/2015/wordml/symex" xmlns:wpg="http://schemas.microsoft.com/office/word/2010/wordprocessingGroup" xmlns:wpi="http://schemas.microsoft.com/office/word/2010/wordprocessingInk" xmlns:wne="http://schemas.microsoft.com/office/word/2006/wordml" xmlns:wps="http://schemas.microsoft.com/office/word/2010/wordprocessingShape" mc:Ignorable="w14 w15 w16se w16cid w16 w16cex w16sdtdh w16sdtfl w16du wp14">
+<w:hdr xmlns:wpc="http://schemas.microsoft.com/office/word/2010/wordprocessingCanvas" xmlns:cx="http://schemas.microsoft.com/office/drawing/2014/chartex" xmlns:cx1="http://schemas.microsoft.com/office/drawing/2015/9/8/chartex" xmlns:cx2="http://schemas.microsoft.com/office/drawing/2015/10/21/chartex" xmlns:cx3="http://schemas.microsoft.com/office/drawing/2016/5/9/chartex" xmlns:cx4="http://schemas.microsoft.com/office/drawing/2016/5/10/chartex" xmlns:cx5="http://schemas.microsoft.com/office/drawing/2016/5/11/chartex" xmlns:cx6="http://schemas.microsoft.com/office/drawing/2016/5/12/chartex" xmlns:cx7="http://schemas.microsoft.com/office/drawing/2016/5/13/chartex" xmlns:cx8="http://schemas.microsoft.com/office/drawing/2016/5/14/chartex" xmlns:mc="http://schemas.openxmlformats.org/markup-compatibility/2006" xmlns:aink="http://schemas.microsoft.com/office/drawing/2016/ink" xmlns:am3d="http://schemas.microsoft.com/office/drawing/2017/model3d" xmlns:o="urn:schemas-microsoft-com:office:office" xmlns:oel="http://schemas.microsoft.com/office/2019/extlst" xmlns:r="http://schemas.openxmlformats.org/officeDocument/2006/relationships" xmlns:m="http://schemas.openxmlformats.org/officeDocument/2006/math" xmlns:v="urn:schemas-microsoft-com:vml" xmlns:wp14="http://schemas.microsoft.com/office/word/2010/wordprocessingDrawing" xmlns:wp="http://schemas.openxmlformats.org/drawingml/2006/wordprocessingDrawing" xmlns:w10="urn:schemas-microsoft-com:office:word" xmlns:w="http://schemas.openxmlformats.org/wordprocessingml/2006/main" xmlns:w14="http://schemas.microsoft.com/office/word/2010/wordml" xmlns:w15="http://schemas.microsoft.com/office/word/2012/wordml" xmlns:w16cei="http://schemas.microsoft.com/office/word/2026/wordml/cei" xmlns:w16cex="http://schemas.microsoft.com/office/word/2018/wordml/cex" xmlns:w16cid="http://schemas.microsoft.com/office/word/2016/wordml/cid" xmlns:w16="http://schemas.microsoft.com/office/word/2018/wordml" xmlns:w16du="http://schemas.microsoft.com/office/word/2023/wordml/word16du" xmlns:w16sdtdh="http://schemas.microsoft.com/office/word/2020/wordml/sdtdatahash" xmlns:w16sdtfl="http://schemas.microsoft.com/office/word/2024/wordml/sdtformatlock" xmlns:w16se="http://schemas.microsoft.com/office/word/2015/wordml/symex" xmlns:wpg="http://schemas.microsoft.com/office/word/2010/wordprocessingGroup" xmlns:wpi="http://schemas.microsoft.com/office/word/2010/wordprocessingInk" xmlns:wne="http://schemas.microsoft.com/office/word/2006/wordml" xmlns:wps="http://schemas.microsoft.com/office/word/2010/wordprocessingShape" mc:Ignorable="w14 w15 w16se w16cid w16 w16cex w16sdtdh w16sdtfl w16du wp14">
   <w:p>
     <w:pPr>
       <w:pStyle w:val="Header"/>
@@ -19827,7 +19883,7 @@
 </file>
 
 <file path=word/header2.xml><?xml version="1.0" encoding="utf-8"?>
-<w:hdr xmlns:wpc="http://schemas.microsoft.com/office/word/2010/wordprocessingCanvas" xmlns:cx="http://schemas.microsoft.com/office/drawing/2014/chartex" xmlns:cx1="http://schemas.microsoft.com/office/drawing/2015/9/8/chartex" xmlns:cx2="http://schemas.microsoft.com/office/drawing/2015/10/21/chartex" xmlns:cx3="http://schemas.microsoft.com/office/drawing/2016/5/9/chartex" xmlns:cx4="http://schemas.microsoft.com/office/drawing/2016/5/10/chartex" xmlns:cx5="http://schemas.microsoft.com/office/drawing/2016/5/11/chartex" xmlns:cx6="http://schemas.microsoft.com/office/drawing/2016/5/12/chartex" xmlns:cx7="http://schemas.microsoft.com/office/drawing/2016/5/13/chartex" xmlns:cx8="http://schemas.microsoft.com/office/drawing/2016/5/14/chartex" xmlns:mc="http://schemas.openxmlformats.org/markup-compatibility/2006" xmlns:aink="http://schemas.microsoft.com/office/drawing/2016/ink" xmlns:am3d="http://schemas.microsoft.com/office/drawing/2017/model3d" xmlns:o="urn:schemas-microsoft-com:office:office" xmlns:oel="http://schemas.microsoft.com/office/2019/extlst" xmlns:r="http://schemas.openxmlformats.org/officeDocument/2006/relationships" xmlns:m="http://schemas.openxmlformats.org/officeDocument/2006/math" xmlns:v="urn:schemas-microsoft-com:vml" xmlns:wp14="http://schemas.microsoft.com/office/word/2010/wordprocessingDrawing" xmlns:wp="http://schemas.openxmlformats.org/drawingml/2006/wordprocessingDrawing" xmlns:w10="urn:schemas-microsoft-com:office:word" xmlns:w="http://schemas.openxmlformats.org/wordprocessingml/2006/main" xmlns:w14="http://schemas.microsoft.com/office/word/2010/wordml" xmlns:w15="http://schemas.microsoft.com/office/word/2012/wordml" xmlns:w16cex="http://schemas.microsoft.com/office/word/2018/wordml/cex" xmlns:w16cid="http://schemas.microsoft.com/office/word/2016/wordml/cid" xmlns:w16="http://schemas.microsoft.com/office/word/2018/wordml" xmlns:w16du="http://schemas.microsoft.com/office/word/2023/wordml/word16du" xmlns:w16sdtdh="http://schemas.microsoft.com/office/word/2020/wordml/sdtdatahash" xmlns:w16sdtfl="http://schemas.microsoft.com/office/word/2024/wordml/sdtformatlock" xmlns:w16se="http://schemas.microsoft.com/office/word/2015/wordml/symex" xmlns:wpg="http://schemas.microsoft.com/office/word/2010/wordprocessingGroup" xmlns:wpi="http://schemas.microsoft.com/office/word/2010/wordprocessingInk" xmlns:wne="http://schemas.microsoft.com/office/word/2006/wordml" xmlns:wps="http://schemas.microsoft.com/office/word/2010/wordprocessingShape" mc:Ignorable="w14 w15 w16se w16cid w16 w16cex w16sdtdh w16sdtfl w16du wp14">
+<w:hdr xmlns:wpc="http://schemas.microsoft.com/office/word/2010/wordprocessingCanvas" xmlns:cx="http://schemas.microsoft.com/office/drawing/2014/chartex" xmlns:cx1="http://schemas.microsoft.com/office/drawing/2015/9/8/chartex" xmlns:cx2="http://schemas.microsoft.com/office/drawing/2015/10/21/chartex" xmlns:cx3="http://schemas.microsoft.com/office/drawing/2016/5/9/chartex" xmlns:cx4="http://schemas.microsoft.com/office/drawing/2016/5/10/chartex" xmlns:cx5="http://schemas.microsoft.com/office/drawing/2016/5/11/chartex" xmlns:cx6="http://schemas.microsoft.com/office/drawing/2016/5/12/chartex" xmlns:cx7="http://schemas.microsoft.com/office/drawing/2016/5/13/chartex" xmlns:cx8="http://schemas.microsoft.com/office/drawing/2016/5/14/chartex" xmlns:mc="http://schemas.openxmlformats.org/markup-compatibility/2006" xmlns:aink="http://schemas.microsoft.com/office/drawing/2016/ink" xmlns:am3d="http://schemas.microsoft.com/office/drawing/2017/model3d" xmlns:o="urn:schemas-microsoft-com:office:office" xmlns:oel="http://schemas.microsoft.com/office/2019/extlst" xmlns:r="http://schemas.openxmlformats.org/officeDocument/2006/relationships" xmlns:m="http://schemas.openxmlformats.org/officeDocument/2006/math" xmlns:v="urn:schemas-microsoft-com:vml" xmlns:wp14="http://schemas.microsoft.com/office/word/2010/wordprocessingDrawing" xmlns:wp="http://schemas.openxmlformats.org/drawingml/2006/wordprocessingDrawing" xmlns:w10="urn:schemas-microsoft-com:office:word" xmlns:w="http://schemas.openxmlformats.org/wordprocessingml/2006/main" xmlns:w14="http://schemas.microsoft.com/office/word/2010/wordml" xmlns:w15="http://schemas.microsoft.com/office/word/2012/wordml" xmlns:w16cei="http://schemas.microsoft.com/office/word/2026/wordml/cei" xmlns:w16cex="http://schemas.microsoft.com/office/word/2018/wordml/cex" xmlns:w16cid="http://schemas.microsoft.com/office/word/2016/wordml/cid" xmlns:w16="http://schemas.microsoft.com/office/word/2018/wordml" xmlns:w16du="http://schemas.microsoft.com/office/word/2023/wordml/word16du" xmlns:w16sdtdh="http://schemas.microsoft.com/office/word/2020/wordml/sdtdatahash" xmlns:w16sdtfl="http://schemas.microsoft.com/office/word/2024/wordml/sdtformatlock" xmlns:w16se="http://schemas.microsoft.com/office/word/2015/wordml/symex" xmlns:wpg="http://schemas.microsoft.com/office/word/2010/wordprocessingGroup" xmlns:wpi="http://schemas.microsoft.com/office/word/2010/wordprocessingInk" xmlns:wne="http://schemas.microsoft.com/office/word/2006/wordml" xmlns:wps="http://schemas.microsoft.com/office/word/2010/wordprocessingShape" mc:Ignorable="w14 w15 w16se w16cid w16 w16cex w16sdtdh w16sdtfl w16du wp14">
   <w:p>
     <w:pPr>
       <w:pStyle w:val="Header"/>
@@ -19870,7 +19926,7 @@
 </file>
 
 <file path=word/numbering.xml><?xml version="1.0" encoding="utf-8"?>
-<w:numbering xmlns:wpc="http://schemas.microsoft.com/office/word/2010/wordprocessingCanvas" xmlns:cx="http://schemas.microsoft.com/office/drawing/2014/chartex" xmlns:cx1="http://schemas.microsoft.com/office/drawing/2015/9/8/chartex" xmlns:cx2="http://schemas.microsoft.com/office/drawing/2015/10/21/chartex" xmlns:cx3="http://schemas.microsoft.com/office/drawing/2016/5/9/chartex" xmlns:cx4="http://schemas.microsoft.com/office/drawing/2016/5/10/chartex" xmlns:cx5="http://schemas.microsoft.com/office/drawing/2016/5/11/chartex" xmlns:cx6="http://schemas.microsoft.com/office/drawing/2016/5/12/chartex" xmlns:cx7="http://schemas.microsoft.com/office/drawing/2016/5/13/chartex" xmlns:cx8="http://schemas.microsoft.com/office/drawing/2016/5/14/chartex" xmlns:mc="http://schemas.openxmlformats.org/markup-compatibility/2006" xmlns:aink="http://schemas.microsoft.com/office/drawing/2016/ink" xmlns:am3d="http://schemas.microsoft.com/office/drawing/2017/model3d" xmlns:o="urn:schemas-microsoft-com:office:office" xmlns:oel="http://schemas.microsoft.com/office/2019/extlst" xmlns:r="http://schemas.openxmlformats.org/officeDocument/2006/relationships" xmlns:m="http://schemas.openxmlformats.org/officeDocument/2006/math" xmlns:v="urn:schemas-microsoft-com:vml" xmlns:wp14="http://schemas.microsoft.com/office/word/2010/wordprocessingDrawing" xmlns:wp="http://schemas.openxmlformats.org/drawingml/2006/wordprocessingDrawing" xmlns:w10="urn:schemas-microsoft-com:office:word" xmlns:w="http://schemas.openxmlformats.org/wordprocessingml/2006/main" xmlns:w14="http://schemas.microsoft.com/office/word/2010/wordml" xmlns:w15="http://schemas.microsoft.com/office/word/2012/wordml" xmlns:w16cex="http://schemas.microsoft.com/office/word/2018/wordml/cex" xmlns:w16cid="http://schemas.microsoft.com/office/word/2016/wordml/cid" xmlns:w16="http://schemas.microsoft.com/office/word/2018/wordml" xmlns:w16du="http://schemas.microsoft.com/office/word/2023/wordml/word16du" xmlns:w16sdtdh="http://schemas.microsoft.com/office/word/2020/wordml/sdtdatahash" xmlns:w16sdtfl="http://schemas.microsoft.com/office/word/2024/wordml/sdtformatlock" xmlns:w16se="http://schemas.microsoft.com/office/word/2015/wordml/symex" xmlns:wpg="http://schemas.microsoft.com/office/word/2010/wordprocessingGroup" xmlns:wpi="http://schemas.microsoft.com/office/word/2010/wordprocessingInk" xmlns:wne="http://schemas.microsoft.com/office/word/2006/wordml" xmlns:wps="http://schemas.microsoft.com/office/word/2010/wordprocessingShape" mc:Ignorable="w14 w15 w16se w16cid w16 w16cex w16sdtdh w16sdtfl w16du wp14">
+<w:numbering xmlns:wpc="http://schemas.microsoft.com/office/word/2010/wordprocessingCanvas" xmlns:cx="http://schemas.microsoft.com/office/drawing/2014/chartex" xmlns:cx1="http://schemas.microsoft.com/office/drawing/2015/9/8/chartex" xmlns:cx2="http://schemas.microsoft.com/office/drawing/2015/10/21/chartex" xmlns:cx3="http://schemas.microsoft.com/office/drawing/2016/5/9/chartex" xmlns:cx4="http://schemas.microsoft.com/office/drawing/2016/5/10/chartex" xmlns:cx5="http://schemas.microsoft.com/office/drawing/2016/5/11/chartex" xmlns:cx6="http://schemas.microsoft.com/office/drawing/2016/5/12/chartex" xmlns:cx7="http://schemas.microsoft.com/office/drawing/2016/5/13/chartex" xmlns:cx8="http://schemas.microsoft.com/office/drawing/2016/5/14/chartex" xmlns:mc="http://schemas.openxmlformats.org/markup-compatibility/2006" xmlns:aink="http://schemas.microsoft.com/office/drawing/2016/ink" xmlns:am3d="http://schemas.microsoft.com/office/drawing/2017/model3d" xmlns:o="urn:schemas-microsoft-com:office:office" xmlns:oel="http://schemas.microsoft.com/office/2019/extlst" xmlns:r="http://schemas.openxmlformats.org/officeDocument/2006/relationships" xmlns:m="http://schemas.openxmlformats.org/officeDocument/2006/math" xmlns:v="urn:schemas-microsoft-com:vml" xmlns:wp14="http://schemas.microsoft.com/office/word/2010/wordprocessingDrawing" xmlns:wp="http://schemas.openxmlformats.org/drawingml/2006/wordprocessingDrawing" xmlns:w10="urn:schemas-microsoft-com:office:word" xmlns:w="http://schemas.openxmlformats.org/wordprocessingml/2006/main" xmlns:w14="http://schemas.microsoft.com/office/word/2010/wordml" xmlns:w15="http://schemas.microsoft.com/office/word/2012/wordml" xmlns:w16cei="http://schemas.microsoft.com/office/word/2026/wordml/cei" xmlns:w16cex="http://schemas.microsoft.com/office/word/2018/wordml/cex" xmlns:w16cid="http://schemas.microsoft.com/office/word/2016/wordml/cid" xmlns:w16="http://schemas.microsoft.com/office/word/2018/wordml" xmlns:w16du="http://schemas.microsoft.com/office/word/2023/wordml/word16du" xmlns:w16sdtdh="http://schemas.microsoft.com/office/word/2020/wordml/sdtdatahash" xmlns:w16sdtfl="http://schemas.microsoft.com/office/word/2024/wordml/sdtformatlock" xmlns:w16se="http://schemas.microsoft.com/office/word/2015/wordml/symex" xmlns:wpg="http://schemas.microsoft.com/office/word/2010/wordprocessingGroup" xmlns:wpi="http://schemas.microsoft.com/office/word/2010/wordprocessingInk" xmlns:wne="http://schemas.microsoft.com/office/word/2006/wordml" xmlns:wps="http://schemas.microsoft.com/office/word/2010/wordprocessingShape" mc:Ignorable="w14 w15 w16se w16cid w16 w16cex w16sdtdh w16sdtfl w16du wp14">
   <w:abstractNum w:abstractNumId="0" w15:restartNumberingAfterBreak="0">
     <w:nsid w:val="FFFFFF7C"/>
     <w:multiLevelType w:val="singleLevel"/>
@@ -24051,6 +24107,14 @@
   </w:num>
   <w:numIdMacAtCleanup w:val="78"/>
 </w:numbering>
+</file>
+
+<file path=word/people.xml><?xml version="1.0" encoding="utf-8"?>
+<w15:people xmlns:wpc="http://schemas.microsoft.com/office/word/2010/wordprocessingCanvas" xmlns:cx="http://schemas.microsoft.com/office/drawing/2014/chartex" xmlns:cx1="http://schemas.microsoft.com/office/drawing/2015/9/8/chartex" xmlns:cx2="http://schemas.microsoft.com/office/drawing/2015/10/21/chartex" xmlns:cx3="http://schemas.microsoft.com/office/drawing/2016/5/9/chartex" xmlns:cx4="http://schemas.microsoft.com/office/drawing/2016/5/10/chartex" xmlns:cx5="http://schemas.microsoft.com/office/drawing/2016/5/11/chartex" xmlns:cx6="http://schemas.microsoft.com/office/drawing/2016/5/12/chartex" xmlns:cx7="http://schemas.microsoft.com/office/drawing/2016/5/13/chartex" xmlns:cx8="http://schemas.microsoft.com/office/drawing/2016/5/14/chartex" xmlns:mc="http://schemas.openxmlformats.org/markup-compatibility/2006" xmlns:aink="http://schemas.microsoft.com/office/drawing/2016/ink" xmlns:am3d="http://schemas.microsoft.com/office/drawing/2017/model3d" xmlns:o="urn:schemas-microsoft-com:office:office" xmlns:oel="http://schemas.microsoft.com/office/2019/extlst" xmlns:r="http://schemas.openxmlformats.org/officeDocument/2006/relationships" xmlns:m="http://schemas.openxmlformats.org/officeDocument/2006/math" xmlns:v="urn:schemas-microsoft-com:vml" xmlns:wp14="http://schemas.microsoft.com/office/word/2010/wordprocessingDrawing" xmlns:wp="http://schemas.openxmlformats.org/drawingml/2006/wordprocessingDrawing" xmlns:w10="urn:schemas-microsoft-com:office:word" xmlns:w="http://schemas.openxmlformats.org/wordprocessingml/2006/main" xmlns:w14="http://schemas.microsoft.com/office/word/2010/wordml" xmlns:w15="http://schemas.microsoft.com/office/word/2012/wordml" xmlns:w16cei="http://schemas.microsoft.com/office/word/2026/wordml/cei" xmlns:w16cex="http://schemas.microsoft.com/office/word/2018/wordml/cex" xmlns:w16cid="http://schemas.microsoft.com/office/word/2016/wordml/cid" xmlns:w16="http://schemas.microsoft.com/office/word/2018/wordml" xmlns:w16du="http://schemas.microsoft.com/office/word/2023/wordml/word16du" xmlns:w16sdtdh="http://schemas.microsoft.com/office/word/2020/wordml/sdtdatahash" xmlns:w16sdtfl="http://schemas.microsoft.com/office/word/2024/wordml/sdtformatlock" xmlns:w16se="http://schemas.microsoft.com/office/word/2015/wordml/symex" xmlns:wpg="http://schemas.microsoft.com/office/word/2010/wordprocessingGroup" xmlns:wpi="http://schemas.microsoft.com/office/word/2010/wordprocessingInk" xmlns:wne="http://schemas.microsoft.com/office/word/2006/wordml" xmlns:wps="http://schemas.microsoft.com/office/word/2010/wordprocessingShape" mc:Ignorable="w14 w15 w16se w16cid w16 w16cex w16sdtdh w16sdtfl w16du wp14">
+  <w15:person w15:author="Druckenmueller, Marc">
+    <w15:presenceInfo w15:providerId="AD" w15:userId="S::marc.druckenmueller@philips.com::821bfe2a-0df8-4931-9eb7-645df23f931a"/>
+  </w15:person>
+</w15:people>
 </file>
 
 <file path=word/styles.xml><?xml version="1.0" encoding="utf-8"?>
@@ -27151,10 +27215,18 @@
 
 <file path=customXml/item2.xml><?xml version="1.0" encoding="utf-8"?>
 <?mso-contentType ?>
-<SharedContentType xmlns="Microsoft.SharePoint.Taxonomy.ContentTypeSync" SourceId="e40374fb-a6cc-4854-989f-c1d94a7967ee" ContentTypeId="0x01" PreviousValue="false"/>
+<FormTemplates xmlns="http://schemas.microsoft.com/sharepoint/v3/contenttype/forms">
+  <Display>DocumentLibraryForm</Display>
+  <Edit>DocumentLibraryForm</Edit>
+  <New>DocumentLibraryForm</New>
+</FormTemplates>
 </file>
 
 <file path=customXml/item3.xml><?xml version="1.0" encoding="utf-8"?>
+<b:Sources xmlns:b="http://schemas.openxmlformats.org/officeDocument/2006/bibliography" xmlns="http://schemas.openxmlformats.org/officeDocument/2006/bibliography" SelectedStyle="\APA.XSL" StyleName="APA"/>
+</file>
+
+<file path=customXml/item4.xml><?xml version="1.0" encoding="utf-8"?>
 <p:properties xmlns:p="http://schemas.microsoft.com/office/2006/metadata/properties" xmlns:xsi="http://www.w3.org/2001/XMLSchema-instance" xmlns:pc="http://schemas.microsoft.com/office/infopath/2007/PartnerControls">
   <documentManagement>
     <lcf76f155ced4ddcb4097134ff3c332f xmlns="508723e2-97ff-4f3e-968e-aabf624d85e3">
@@ -27165,17 +27237,9 @@
 </p:properties>
 </file>
 
-<file path=customXml/item4.xml><?xml version="1.0" encoding="utf-8"?>
-<b:Sources xmlns:b="http://schemas.openxmlformats.org/officeDocument/2006/bibliography" xmlns="http://schemas.openxmlformats.org/officeDocument/2006/bibliography" SelectedStyle="\APA.XSL" StyleName="APA"/>
-</file>
-
 <file path=customXml/item5.xml><?xml version="1.0" encoding="utf-8"?>
 <?mso-contentType ?>
-<FormTemplates xmlns="http://schemas.microsoft.com/sharepoint/v3/contenttype/forms">
-  <Display>DocumentLibraryForm</Display>
-  <Edit>DocumentLibraryForm</Edit>
-  <New>DocumentLibraryForm</New>
-</FormTemplates>
+<SharedContentType xmlns="Microsoft.SharePoint.Taxonomy.ContentTypeSync" SourceId="e40374fb-a6cc-4854-989f-c1d94a7967ee" ContentTypeId="0x01" PreviousValue="false"/>
 </file>
 
 <file path=customXml/itemProps1.xml><?xml version="1.0" encoding="utf-8"?>
@@ -27199,14 +27263,22 @@
 </file>
 
 <file path=customXml/itemProps2.xml><?xml version="1.0" encoding="utf-8"?>
-<ds:datastoreItem xmlns:ds="http://schemas.openxmlformats.org/officeDocument/2006/customXml" ds:itemID="{EDFBD775-7C77-4D7C-959B-56F641F02644}">
+<ds:datastoreItem xmlns:ds="http://schemas.openxmlformats.org/officeDocument/2006/customXml" ds:itemID="{5E041B18-6380-4666-9712-14D0E20233AD}">
   <ds:schemaRefs>
-    <ds:schemaRef ds:uri="Microsoft.SharePoint.Taxonomy.ContentTypeSync"/>
+    <ds:schemaRef ds:uri="http://schemas.microsoft.com/sharepoint/v3/contenttype/forms"/>
   </ds:schemaRefs>
 </ds:datastoreItem>
 </file>
 
 <file path=customXml/itemProps3.xml><?xml version="1.0" encoding="utf-8"?>
+<ds:datastoreItem xmlns:ds="http://schemas.openxmlformats.org/officeDocument/2006/customXml" ds:itemID="{CF7CC830-FE2E-4AE0-93CC-5C48A583F458}">
+  <ds:schemaRefs>
+    <ds:schemaRef ds:uri="http://schemas.openxmlformats.org/officeDocument/2006/bibliography"/>
+  </ds:schemaRefs>
+</ds:datastoreItem>
+</file>
+
+<file path=customXml/itemProps4.xml><?xml version="1.0" encoding="utf-8"?>
 <ds:datastoreItem xmlns:ds="http://schemas.openxmlformats.org/officeDocument/2006/customXml" ds:itemID="{AD78DEC8-72DE-44B2-9EA6-1D2D6CFAA3BD}">
   <ds:schemaRefs>
     <ds:schemaRef ds:uri="http://schemas.microsoft.com/office/2006/metadata/properties"/>
@@ -27217,18 +27289,10 @@
 </ds:datastoreItem>
 </file>
 
-<file path=customXml/itemProps4.xml><?xml version="1.0" encoding="utf-8"?>
-<ds:datastoreItem xmlns:ds="http://schemas.openxmlformats.org/officeDocument/2006/customXml" ds:itemID="{CF7CC830-FE2E-4AE0-93CC-5C48A583F458}">
+<file path=customXml/itemProps5.xml><?xml version="1.0" encoding="utf-8"?>
+<ds:datastoreItem xmlns:ds="http://schemas.openxmlformats.org/officeDocument/2006/customXml" ds:itemID="{EDFBD775-7C77-4D7C-959B-56F641F02644}">
   <ds:schemaRefs>
-    <ds:schemaRef ds:uri="http://schemas.openxmlformats.org/officeDocument/2006/bibliography"/>
-  </ds:schemaRefs>
-</ds:datastoreItem>
-</file>
-
-<file path=customXml/itemProps5.xml><?xml version="1.0" encoding="utf-8"?>
-<ds:datastoreItem xmlns:ds="http://schemas.openxmlformats.org/officeDocument/2006/customXml" ds:itemID="{5E041B18-6380-4666-9712-14D0E20233AD}">
-  <ds:schemaRefs>
-    <ds:schemaRef ds:uri="http://schemas.microsoft.com/sharepoint/v3/contenttype/forms"/>
+    <ds:schemaRef ds:uri="Microsoft.SharePoint.Taxonomy.ContentTypeSync"/>
   </ds:schemaRefs>
 </ds:datastoreItem>
 </file>

</xml_diff>